<commit_message>
docs(guide): nouvelles captures (brutes) + en-tête et sommaire DSFR
- Remplace les 30 captures annotées par les 21 nouvelles captures brutes
  (doublons supprimés : github, bandeau, menu-styles, palette, boutons-aperçu,
  telechargement-champs, annexeB-templates).
- MD : repointage des références vers les captures conservées, retrait des
  images supprimées. Cohérence MD ↔ img/ vérifiée (21 = 21).
- HTML aligné DSFR : bloc-marque Marianne en en-tête (assets/header.html),
  sommaire type « fr-summary ». build.sh inclut l'en-tête.
- HTML / Word / PDF régénérés.

Co-Authored-By: Claude Opus 4.8 (1M context) <noreply@anthropic.com>
</commit_message>
<xml_diff>
--- a/docs/guide-contributeur/guide-contributeur.docx
+++ b/docs/guide-contributeur/guide-contributeur.docx
@@ -28,7 +28,7 @@
         </w:p>
       </w:sdtContent>
     </w:sdt>
-    <w:bookmarkStart w:id="239" w:name="X510c248f35fa6736c380abd29eb45c6e743d7b8"/>
+    <w:bookmarkStart w:id="224" w:name="X510c248f35fa6736c380abd29eb45c6e743d7b8"/>
     <w:p>
       <w:pPr>
         <w:pStyle w:val="Heading1"/>
@@ -535,7 +535,7 @@
       <w:r>
         <w:drawing>
           <wp:inline>
-            <wp:extent cx="5334000" cy="3050641"/>
+            <wp:extent cx="5334000" cy="2619750"/>
             <wp:effectExtent b="0" l="0" r="0" t="0"/>
             <wp:docPr descr="Le thème DSFR sélectionné dans les réglages généraux du questionnaire" title="" id="12" name="Picture"/>
             <a:graphic>
@@ -556,7 +556,7 @@
                   <pic:spPr bwMode="auto">
                     <a:xfrm>
                       <a:off x="0" y="0"/>
-                      <a:ext cx="5334000" cy="3050641"/>
+                      <a:ext cx="5334000" cy="2619750"/>
                     </a:xfrm>
                     <a:prstGeom prst="rect">
                       <a:avLst/>
@@ -1322,7 +1322,7 @@
       <w:r>
         <w:drawing>
           <wp:inline>
-            <wp:extent cx="5334000" cy="2980589"/>
+            <wp:extent cx="5334000" cy="3272392"/>
             <wp:effectExtent b="0" l="0" r="0" t="0"/>
             <wp:docPr descr="Un questionnaire rendu avec le thème DSFR : en-tête Marianne, libellé de question en titre, texte d’aide enrichi en dessous" title="" id="20" name="Picture"/>
             <a:graphic>
@@ -1343,7 +1343,7 @@
                   <pic:spPr bwMode="auto">
                     <a:xfrm>
                       <a:off x="0" y="0"/>
-                      <a:ext cx="5334000" cy="2980589"/>
+                      <a:ext cx="5334000" cy="3272392"/>
                     </a:xfrm>
                     <a:prstGeom prst="rect">
                       <a:avLst/>
@@ -1752,7 +1752,7 @@
       <w:r>
         <w:drawing>
           <wp:inline>
-            <wp:extent cx="5334000" cy="248950"/>
+            <wp:extent cx="5334000" cy="2301911"/>
             <wp:effectExtent b="0" l="0" r="0" t="0"/>
             <wp:docPr descr="Panneau des options avancées du thème DSFR, avec ses onglets" title="" id="26" name="Picture"/>
             <a:graphic>
@@ -1773,7 +1773,7 @@
                   <pic:spPr bwMode="auto">
                     <a:xfrm>
                       <a:off x="0" y="0"/>
-                      <a:ext cx="5334000" cy="248950"/>
+                      <a:ext cx="5334000" cy="2301911"/>
                     </a:xfrm>
                     <a:prstGeom prst="rect">
                       <a:avLst/>
@@ -1823,7 +1823,7 @@
       <w:r>
         <w:drawing>
           <wp:inline>
-            <wp:extent cx="5334000" cy="1613569"/>
+            <wp:extent cx="5334000" cy="2315583"/>
             <wp:effectExtent b="0" l="0" r="0" t="0"/>
             <wp:docPr descr="Onglet Options générales du thème DSFR" title="" id="29" name="Picture"/>
             <a:graphic>
@@ -1844,7 +1844,7 @@
                   <pic:spPr bwMode="auto">
                     <a:xfrm>
                       <a:off x="0" y="0"/>
-                      <a:ext cx="5334000" cy="1613569"/>
+                      <a:ext cx="5334000" cy="2315583"/>
                     </a:xfrm>
                     <a:prstGeom prst="rect">
                       <a:avLst/>
@@ -3240,14 +3240,14 @@
       <w:r>
         <w:drawing>
           <wp:inline>
-            <wp:extent cx="5334000" cy="565013"/>
+            <wp:extent cx="5334000" cy="550015"/>
             <wp:effectExtent b="0" l="0" r="0" t="0"/>
             <wp:docPr descr="Repères contributeur affichés en prévisualisation, signalant une mise en forme non conservée" title="" id="39" name="Picture"/>
             <a:graphic>
               <a:graphicData uri="http://schemas.openxmlformats.org/drawingml/2006/picture">
                 <pic:pic>
                   <pic:nvPicPr>
-                    <pic:cNvPr descr="img/c2a-contributor-hints.png" id="40" name="Picture"/>
+                    <pic:cNvPr descr="img/8-couleur-vers-composant.png" id="40" name="Picture"/>
                     <pic:cNvPicPr>
                       <a:picLocks noChangeArrowheads="1" noChangeAspect="1"/>
                     </pic:cNvPicPr>
@@ -3261,7 +3261,7 @@
                   <pic:spPr bwMode="auto">
                     <a:xfrm>
                       <a:off x="0" y="0"/>
-                      <a:ext cx="5334000" cy="565013"/>
+                      <a:ext cx="5334000" cy="550015"/>
                     </a:xfrm>
                     <a:prstGeom prst="rect">
                       <a:avLst/>
@@ -3432,7 +3432,7 @@
       <w:r>
         <w:drawing>
           <wp:inline>
-            <wp:extent cx="5334000" cy="1207872"/>
+            <wp:extent cx="5334000" cy="1811311"/>
             <wp:effectExtent b="0" l="0" r="0" t="0"/>
             <wp:docPr descr="Onglet Images du thème avec l’option de logo opérateur" title="" id="45" name="Picture"/>
             <a:graphic>
@@ -3453,7 +3453,7 @@
                   <pic:spPr bwMode="auto">
                     <a:xfrm>
                       <a:off x="0" y="0"/>
-                      <a:ext cx="5334000" cy="1207872"/>
+                      <a:ext cx="5334000" cy="1811311"/>
                     </a:xfrm>
                     <a:prstGeom prst="rect">
                       <a:avLst/>
@@ -4155,7 +4155,7 @@
       <w:r>
         <w:drawing>
           <wp:inline>
-            <wp:extent cx="5334000" cy="1576687"/>
+            <wp:extent cx="5334000" cy="2339473"/>
             <wp:effectExtent b="0" l="0" r="0" t="0"/>
             <wp:docPr descr="Onglet Header et footer avec les champs de titre et de bloc-marque" title="" id="53" name="Picture"/>
             <a:graphic>
@@ -4176,7 +4176,7 @@
                   <pic:spPr bwMode="auto">
                     <a:xfrm>
                       <a:off x="0" y="0"/>
-                      <a:ext cx="5334000" cy="1576687"/>
+                      <a:ext cx="5334000" cy="2339473"/>
                     </a:xfrm>
                     <a:prstGeom prst="rect">
                       <a:avLst/>
@@ -5376,7 +5376,7 @@
       <w:r>
         <w:drawing>
           <wp:inline>
-            <wp:extent cx="5334000" cy="1023464"/>
+            <wp:extent cx="5334000" cy="2103371"/>
             <wp:effectExtent b="0" l="0" r="0" t="0"/>
             <wp:docPr descr="Onglet Accessibilité avec la mention de conformité RGAA" title="" id="65" name="Picture"/>
             <a:graphic>
@@ -5397,7 +5397,7 @@
                   <pic:spPr bwMode="auto">
                     <a:xfrm>
                       <a:off x="0" y="0"/>
-                      <a:ext cx="5334000" cy="1023464"/>
+                      <a:ext cx="5334000" cy="2103371"/>
                     </a:xfrm>
                     <a:prstGeom prst="rect">
                       <a:avLst/>
@@ -7397,7 +7397,7 @@
       <w:r>
         <w:drawing>
           <wp:inline>
-            <wp:extent cx="5334000" cy="1161770"/>
+            <wp:extent cx="5334000" cy="1784216"/>
             <wp:effectExtent b="0" l="0" r="0" t="0"/>
             <wp:docPr descr="Onglet Protection anti-bot avec le défi texte accessible" title="" id="87" name="Picture"/>
             <a:graphic>
@@ -7418,7 +7418,7 @@
                   <pic:spPr bwMode="auto">
                     <a:xfrm>
                       <a:off x="0" y="0"/>
-                      <a:ext cx="5334000" cy="1161770"/>
+                      <a:ext cx="5334000" cy="1784216"/>
                     </a:xfrm>
                     <a:prstGeom prst="rect">
                       <a:avLst/>
@@ -8333,7 +8333,7 @@
     </w:p>
     <w:bookmarkEnd w:id="93"/>
     <w:bookmarkEnd w:id="94"/>
-    <w:bookmarkStart w:id="103" w:name="créer-un-questionnaire"/>
+    <w:bookmarkStart w:id="102" w:name="créer-un-questionnaire"/>
     <w:p>
       <w:pPr>
         <w:pStyle w:val="Heading2"/>
@@ -9168,7 +9168,7 @@
     </w:tbl>
     <w:bookmarkEnd w:id="97"/>
     <w:bookmarkEnd w:id="98"/>
-    <w:bookmarkStart w:id="102" w:name="Xa7fc30df5067b6c1ec973b69d2cca03863a20d0"/>
+    <w:bookmarkStart w:id="101" w:name="Xa7fc30df5067b6c1ec973b69d2cca03863a20d0"/>
     <w:p>
       <w:pPr>
         <w:pStyle w:val="Heading3"/>
@@ -9261,20 +9261,20 @@
       <w:r>
         <w:drawing>
           <wp:inline>
-            <wp:extent cx="5334000" cy="565013"/>
+            <wp:extent cx="5334000" cy="550015"/>
             <wp:effectExtent b="0" l="0" r="0" t="0"/>
-            <wp:docPr descr="Bandeau « Aperçu contributeur » affiché en haut de la prévisualisation" title="" id="100" name="Picture"/>
+            <wp:docPr descr="Bandeau « Aperçu contributeur » affiché en haut de la prévisualisation" title="" id="99" name="Picture"/>
             <a:graphic>
               <a:graphicData uri="http://schemas.openxmlformats.org/drawingml/2006/picture">
                 <pic:pic>
                   <pic:nvPicPr>
-                    <pic:cNvPr descr="img/apercu-contributeur-bandeau.png" id="101" name="Picture"/>
+                    <pic:cNvPr descr="img/8-couleur-vers-composant.png" id="100" name="Picture"/>
                     <pic:cNvPicPr>
                       <a:picLocks noChangeArrowheads="1" noChangeAspect="1"/>
                     </pic:cNvPicPr>
                   </pic:nvPicPr>
                   <pic:blipFill>
-                    <a:blip r:embed="rId99"/>
+                    <a:blip r:embed="rId38"/>
                     <a:stretch>
                       <a:fillRect/>
                     </a:stretch>
@@ -9282,7 +9282,7 @@
                   <pic:spPr bwMode="auto">
                     <a:xfrm>
                       <a:off x="0" y="0"/>
-                      <a:ext cx="5334000" cy="565013"/>
+                      <a:ext cx="5334000" cy="550015"/>
                     </a:xfrm>
                     <a:prstGeom prst="rect">
                       <a:avLst/>
@@ -9414,9 +9414,9 @@
         </w:pict>
       </w:r>
     </w:p>
+    <w:bookmarkEnd w:id="101"/>
     <w:bookmarkEnd w:id="102"/>
-    <w:bookmarkEnd w:id="103"/>
-    <w:bookmarkStart w:id="122" w:name="Xe7c5b4bd5f51396f74ec1cfc2c7578257565eb3"/>
+    <w:bookmarkStart w:id="121" w:name="Xe7c5b4bd5f51396f74ec1cfc2c7578257565eb3"/>
     <w:p>
       <w:pPr>
         <w:pStyle w:val="Heading2"/>
@@ -9539,7 +9539,7 @@
         <w:t xml:space="preserve">, puis choisissez le composant qui porte ce sens (voir Annexe B). Ne simulez jamais une intention par un simple effet visuel.</w:t>
       </w:r>
     </w:p>
-    <w:bookmarkStart w:id="107" w:name="des-intitulés-de-liens-explicites"/>
+    <w:bookmarkStart w:id="106" w:name="des-intitulés-de-liens-explicites"/>
     <w:p>
       <w:pPr>
         <w:pStyle w:val="Heading3"/>
@@ -9890,20 +9890,20 @@
       <w:r>
         <w:drawing>
           <wp:inline>
-            <wp:extent cx="5334000" cy="557182"/>
+            <wp:extent cx="2724016" cy="1330036"/>
             <wp:effectExtent b="0" l="0" r="0" t="0"/>
-            <wp:docPr descr="Composant Téléchargement de fichier : intitulé explicite avec format et poids" title="" id="105" name="Picture"/>
+            <wp:docPr descr="Composant Téléchargement de fichier : intitulé explicite avec format et poids" title="" id="104" name="Picture"/>
             <a:graphic>
               <a:graphicData uri="http://schemas.openxmlformats.org/drawingml/2006/picture">
                 <pic:pic>
                   <pic:nvPicPr>
-                    <pic:cNvPr descr="img/3bis-telechargement-fichier.png" id="106" name="Picture"/>
+                    <pic:cNvPr descr="img/3bis-telechargement-fichier.png" id="105" name="Picture"/>
                     <pic:cNvPicPr>
                       <a:picLocks noChangeArrowheads="1" noChangeAspect="1"/>
                     </pic:cNvPicPr>
                   </pic:nvPicPr>
                   <pic:blipFill>
-                    <a:blip r:embed="rId104"/>
+                    <a:blip r:embed="rId103"/>
                     <a:stretch>
                       <a:fillRect/>
                     </a:stretch>
@@ -9911,7 +9911,7 @@
                   <pic:spPr bwMode="auto">
                     <a:xfrm>
                       <a:off x="0" y="0"/>
-                      <a:ext cx="5334000" cy="557182"/>
+                      <a:ext cx="2724016" cy="1330036"/>
                     </a:xfrm>
                     <a:prstGeom prst="rect">
                       <a:avLst/>
@@ -9938,8 +9938,8 @@
         <w:t xml:space="preserve">Composant Téléchargement de fichier : intitulé explicite avec format et poids</w:t>
       </w:r>
     </w:p>
-    <w:bookmarkEnd w:id="107"/>
-    <w:bookmarkStart w:id="111" w:name="des-alternatives-dimages-pertinentes"/>
+    <w:bookmarkEnd w:id="106"/>
+    <w:bookmarkStart w:id="110" w:name="des-alternatives-dimages-pertinentes"/>
     <w:p>
       <w:pPr>
         <w:pStyle w:val="Heading3"/>
@@ -10123,20 +10123,20 @@
       <w:r>
         <w:drawing>
           <wp:inline>
-            <wp:extent cx="3860800" cy="2844800"/>
+            <wp:extent cx="4834170" cy="6752492"/>
             <wp:effectExtent b="0" l="0" r="0" t="0"/>
-            <wp:docPr descr="Champ d’alternative textuelle lors de l’insertion d’une image" title="" id="109" name="Picture"/>
+            <wp:docPr descr="Champ d’alternative textuelle lors de l’insertion d’une image" title="" id="108" name="Picture"/>
             <a:graphic>
               <a:graphicData uri="http://schemas.openxmlformats.org/drawingml/2006/picture">
                 <pic:pic>
                   <pic:nvPicPr>
-                    <pic:cNvPr descr="img/3bis-alt-image.png" id="110" name="Picture"/>
+                    <pic:cNvPr descr="img/3bis-alt-image.png" id="109" name="Picture"/>
                     <pic:cNvPicPr>
                       <a:picLocks noChangeArrowheads="1" noChangeAspect="1"/>
                     </pic:cNvPicPr>
                   </pic:nvPicPr>
                   <pic:blipFill>
-                    <a:blip r:embed="rId108"/>
+                    <a:blip r:embed="rId107"/>
                     <a:stretch>
                       <a:fillRect/>
                     </a:stretch>
@@ -10144,7 +10144,7 @@
                   <pic:spPr bwMode="auto">
                     <a:xfrm>
                       <a:off x="0" y="0"/>
-                      <a:ext cx="3860800" cy="2844800"/>
+                      <a:ext cx="4834170" cy="6752492"/>
                     </a:xfrm>
                     <a:prstGeom prst="rect">
                       <a:avLst/>
@@ -10171,8 +10171,8 @@
         <w:t xml:space="preserve">Champ d’alternative textuelle lors de l’insertion d’une image</w:t>
       </w:r>
     </w:p>
-    <w:bookmarkEnd w:id="111"/>
-    <w:bookmarkStart w:id="115" w:name="une-hiérarchie-de-titres-cohérente"/>
+    <w:bookmarkEnd w:id="110"/>
+    <w:bookmarkStart w:id="114" w:name="une-hiérarchie-de-titres-cohérente"/>
     <w:p>
       <w:pPr>
         <w:pStyle w:val="Heading3"/>
@@ -10346,20 +10346,20 @@
       <w:r>
         <w:drawing>
           <wp:inline>
-            <wp:extent cx="2692400" cy="4470400"/>
+            <wp:extent cx="2851904" cy="3363457"/>
             <wp:effectExtent b="0" l="0" r="0" t="0"/>
-            <wp:docPr descr="Menu Styles de l’éditeur : choix d’un vrai niveau de titre plutôt que du gras" title="" id="113" name="Picture"/>
+            <wp:docPr descr="Menu Styles de l’éditeur : choix d’un vrai niveau de titre plutôt que du gras" title="" id="112" name="Picture"/>
             <a:graphic>
               <a:graphicData uri="http://schemas.openxmlformats.org/drawingml/2006/picture">
                 <pic:pic>
                   <pic:nvPicPr>
-                    <pic:cNvPr descr="img/3bis-menu-styles-titres.png" id="114" name="Picture"/>
+                    <pic:cNvPr descr="img/3bis-menu-styles-titres.png" id="113" name="Picture"/>
                     <pic:cNvPicPr>
                       <a:picLocks noChangeArrowheads="1" noChangeAspect="1"/>
                     </pic:cNvPicPr>
                   </pic:nvPicPr>
                   <pic:blipFill>
-                    <a:blip r:embed="rId112"/>
+                    <a:blip r:embed="rId111"/>
                     <a:stretch>
                       <a:fillRect/>
                     </a:stretch>
@@ -10367,7 +10367,7 @@
                   <pic:spPr bwMode="auto">
                     <a:xfrm>
                       <a:off x="0" y="0"/>
-                      <a:ext cx="2692400" cy="4470400"/>
+                      <a:ext cx="2851904" cy="3363457"/>
                     </a:xfrm>
                     <a:prstGeom prst="rect">
                       <a:avLst/>
@@ -10394,8 +10394,8 @@
         <w:t xml:space="preserve">Menu Styles de l’éditeur : choix d’un vrai niveau de titre plutôt que du gras</w:t>
       </w:r>
     </w:p>
-    <w:bookmarkEnd w:id="115"/>
-    <w:bookmarkStart w:id="119" w:name="X0f97eb2817f01d05e6e278e1a9e4044e1e86df9"/>
+    <w:bookmarkEnd w:id="114"/>
+    <w:bookmarkStart w:id="118" w:name="X0f97eb2817f01d05e6e278e1a9e4044e1e86df9"/>
     <w:p>
       <w:pPr>
         <w:pStyle w:val="Heading3"/>
@@ -10588,20 +10588,20 @@
       <w:r>
         <w:drawing>
           <wp:inline>
-            <wp:extent cx="5334000" cy="697523"/>
+            <wp:extent cx="5334000" cy="2463741"/>
             <wp:effectExtent b="0" l="0" r="0" t="0"/>
-            <wp:docPr descr="Badge : le statut reste lisible par le texte, la couleur ne fait que le renforcer" title="" id="117" name="Picture"/>
+            <wp:docPr descr="Badge : le statut reste lisible par le texte, la couleur ne fait que le renforcer" title="" id="116" name="Picture"/>
             <a:graphic>
               <a:graphicData uri="http://schemas.openxmlformats.org/drawingml/2006/picture">
                 <pic:pic>
                   <pic:nvPicPr>
-                    <pic:cNvPr descr="img/3bis-badge-statut-texte.png" id="118" name="Picture"/>
+                    <pic:cNvPr descr="img/3bis-badge-statut-texte.png" id="117" name="Picture"/>
                     <pic:cNvPicPr>
                       <a:picLocks noChangeArrowheads="1" noChangeAspect="1"/>
                     </pic:cNvPicPr>
                   </pic:nvPicPr>
                   <pic:blipFill>
-                    <a:blip r:embed="rId116"/>
+                    <a:blip r:embed="rId115"/>
                     <a:stretch>
                       <a:fillRect/>
                     </a:stretch>
@@ -10609,7 +10609,7 @@
                   <pic:spPr bwMode="auto">
                     <a:xfrm>
                       <a:off x="0" y="0"/>
-                      <a:ext cx="5334000" cy="697523"/>
+                      <a:ext cx="5334000" cy="2463741"/>
                     </a:xfrm>
                     <a:prstGeom prst="rect">
                       <a:avLst/>
@@ -10636,138 +10636,138 @@
         <w:t xml:space="preserve">Badge : le statut reste lisible par le texte, la couleur ne fait que le renforcer</w:t>
       </w:r>
     </w:p>
+    <w:bookmarkEnd w:id="118"/>
+    <w:bookmarkStart w:id="119" w:name="une-langue-claire"/>
+    <w:p>
+      <w:pPr>
+        <w:pStyle w:val="Heading3"/>
+      </w:pPr>
+      <w:r>
+        <w:t xml:space="preserve">4.5. Une langue claire</w:t>
+      </w:r>
+    </w:p>
+    <w:p>
+      <w:pPr>
+        <w:pStyle w:val="FirstParagraph"/>
+      </w:pPr>
+      <w:r>
+        <w:t xml:space="preserve">L’accessibilité, c’est aussi la</w:t>
+      </w:r>
+      <w:r>
+        <w:t xml:space="preserve"> </w:t>
+      </w:r>
+      <w:r>
+        <w:rPr>
+          <w:b/>
+          <w:bCs/>
+        </w:rPr>
+        <w:t xml:space="preserve">compréhension</w:t>
+      </w:r>
+      <w:r>
+        <w:t xml:space="preserve">. Vos répondants ne connaissent ni votre jargon métier ni les sigles internes.</w:t>
+      </w:r>
+    </w:p>
+    <w:p>
+      <w:pPr>
+        <w:pStyle w:val="Compact"/>
+        <w:numPr>
+          <w:ilvl w:val="0"/>
+          <w:numId w:val="1057"/>
+        </w:numPr>
+      </w:pPr>
+      <w:r>
+        <w:t xml:space="preserve">Phrases courtes, une idée par phrase, vocabulaire courant.</w:t>
+      </w:r>
+    </w:p>
+    <w:p>
+      <w:pPr>
+        <w:pStyle w:val="Compact"/>
+        <w:numPr>
+          <w:ilvl w:val="0"/>
+          <w:numId w:val="1057"/>
+        </w:numPr>
+      </w:pPr>
+      <w:r>
+        <w:rPr>
+          <w:b/>
+          <w:bCs/>
+        </w:rPr>
+        <w:t xml:space="preserve">Développez les sigles</w:t>
+      </w:r>
+      <w:r>
+        <w:t xml:space="preserve"> </w:t>
+      </w:r>
+      <w:r>
+        <w:t xml:space="preserve">à leur première apparition : « le RSA (revenu de solidarité active) ».</w:t>
+      </w:r>
+    </w:p>
+    <w:p>
+      <w:pPr>
+        <w:pStyle w:val="Compact"/>
+        <w:numPr>
+          <w:ilvl w:val="0"/>
+          <w:numId w:val="1057"/>
+        </w:numPr>
+      </w:pPr>
+      <w:r>
+        <w:t xml:space="preserve">Formulez les consignes à l’impératif et de façon concrète : « Indiquez votre date de naissance » plutôt que « Une saisie de la date de naissance est requise ».</w:t>
+      </w:r>
+    </w:p>
+    <w:p>
+      <w:pPr>
+        <w:pStyle w:val="Compact"/>
+        <w:numPr>
+          <w:ilvl w:val="0"/>
+          <w:numId w:val="1057"/>
+        </w:numPr>
+      </w:pPr>
+      <w:r>
+        <w:t xml:space="preserve">Un vocabulaire de statut</w:t>
+      </w:r>
+      <w:r>
+        <w:t xml:space="preserve"> </w:t>
+      </w:r>
+      <w:r>
+        <w:rPr>
+          <w:b/>
+          <w:bCs/>
+        </w:rPr>
+        <w:t xml:space="preserve">stable</w:t>
+      </w:r>
+      <w:r>
+        <w:t xml:space="preserve"> </w:t>
+      </w:r>
+      <w:r>
+        <w:t xml:space="preserve">: dites toujours « Clôturée », jamais tantôt « Fermée » tantôt « Terminée ». La cohérence aide tout le monde, en particulier les personnes en situation de handicap cognitif.</w:t>
+      </w:r>
+    </w:p>
+    <w:p>
+      <w:pPr>
+        <w:pStyle w:val="Compact"/>
+        <w:numPr>
+          <w:ilvl w:val="0"/>
+          <w:numId w:val="1057"/>
+        </w:numPr>
+      </w:pPr>
+      <w:r>
+        <w:t xml:space="preserve">Si votre questionnaire mélange plusieurs langues (un document en anglais, une citation étrangère), la langue de ce passage doit être signalée pour que le lecteur d’écran le prononce correctement. Ce marquage est une opération technique : ne le faites pas vous-même,</w:t>
+      </w:r>
+      <w:r>
+        <w:t xml:space="preserve"> </w:t>
+      </w:r>
+      <w:r>
+        <w:rPr>
+          <w:b/>
+          <w:bCs/>
+        </w:rPr>
+        <w:t xml:space="preserve">demandez-le à votre référent thème / webmestre</w:t>
+      </w:r>
+      <w:r>
+        <w:t xml:space="preserve">.</w:t>
+      </w:r>
+    </w:p>
     <w:bookmarkEnd w:id="119"/>
-    <w:bookmarkStart w:id="120" w:name="une-langue-claire"/>
-    <w:p>
-      <w:pPr>
-        <w:pStyle w:val="Heading3"/>
-      </w:pPr>
-      <w:r>
-        <w:t xml:space="preserve">4.5. Une langue claire</w:t>
-      </w:r>
-    </w:p>
-    <w:p>
-      <w:pPr>
-        <w:pStyle w:val="FirstParagraph"/>
-      </w:pPr>
-      <w:r>
-        <w:t xml:space="preserve">L’accessibilité, c’est aussi la</w:t>
-      </w:r>
-      <w:r>
-        <w:t xml:space="preserve"> </w:t>
-      </w:r>
-      <w:r>
-        <w:rPr>
-          <w:b/>
-          <w:bCs/>
-        </w:rPr>
-        <w:t xml:space="preserve">compréhension</w:t>
-      </w:r>
-      <w:r>
-        <w:t xml:space="preserve">. Vos répondants ne connaissent ni votre jargon métier ni les sigles internes.</w:t>
-      </w:r>
-    </w:p>
-    <w:p>
-      <w:pPr>
-        <w:pStyle w:val="Compact"/>
-        <w:numPr>
-          <w:ilvl w:val="0"/>
-          <w:numId w:val="1057"/>
-        </w:numPr>
-      </w:pPr>
-      <w:r>
-        <w:t xml:space="preserve">Phrases courtes, une idée par phrase, vocabulaire courant.</w:t>
-      </w:r>
-    </w:p>
-    <w:p>
-      <w:pPr>
-        <w:pStyle w:val="Compact"/>
-        <w:numPr>
-          <w:ilvl w:val="0"/>
-          <w:numId w:val="1057"/>
-        </w:numPr>
-      </w:pPr>
-      <w:r>
-        <w:rPr>
-          <w:b/>
-          <w:bCs/>
-        </w:rPr>
-        <w:t xml:space="preserve">Développez les sigles</w:t>
-      </w:r>
-      <w:r>
-        <w:t xml:space="preserve"> </w:t>
-      </w:r>
-      <w:r>
-        <w:t xml:space="preserve">à leur première apparition : « le RSA (revenu de solidarité active) ».</w:t>
-      </w:r>
-    </w:p>
-    <w:p>
-      <w:pPr>
-        <w:pStyle w:val="Compact"/>
-        <w:numPr>
-          <w:ilvl w:val="0"/>
-          <w:numId w:val="1057"/>
-        </w:numPr>
-      </w:pPr>
-      <w:r>
-        <w:t xml:space="preserve">Formulez les consignes à l’impératif et de façon concrète : « Indiquez votre date de naissance » plutôt que « Une saisie de la date de naissance est requise ».</w:t>
-      </w:r>
-    </w:p>
-    <w:p>
-      <w:pPr>
-        <w:pStyle w:val="Compact"/>
-        <w:numPr>
-          <w:ilvl w:val="0"/>
-          <w:numId w:val="1057"/>
-        </w:numPr>
-      </w:pPr>
-      <w:r>
-        <w:t xml:space="preserve">Un vocabulaire de statut</w:t>
-      </w:r>
-      <w:r>
-        <w:t xml:space="preserve"> </w:t>
-      </w:r>
-      <w:r>
-        <w:rPr>
-          <w:b/>
-          <w:bCs/>
-        </w:rPr>
-        <w:t xml:space="preserve">stable</w:t>
-      </w:r>
-      <w:r>
-        <w:t xml:space="preserve"> </w:t>
-      </w:r>
-      <w:r>
-        <w:t xml:space="preserve">: dites toujours « Clôturée », jamais tantôt « Fermée » tantôt « Terminée ». La cohérence aide tout le monde, en particulier les personnes en situation de handicap cognitif.</w:t>
-      </w:r>
-    </w:p>
-    <w:p>
-      <w:pPr>
-        <w:pStyle w:val="Compact"/>
-        <w:numPr>
-          <w:ilvl w:val="0"/>
-          <w:numId w:val="1057"/>
-        </w:numPr>
-      </w:pPr>
-      <w:r>
-        <w:t xml:space="preserve">Si votre questionnaire mélange plusieurs langues (un document en anglais, une citation étrangère), la langue de ce passage doit être signalée pour que le lecteur d’écran le prononce correctement. Ce marquage est une opération technique : ne le faites pas vous-même,</w:t>
-      </w:r>
-      <w:r>
-        <w:t xml:space="preserve"> </w:t>
-      </w:r>
-      <w:r>
-        <w:rPr>
-          <w:b/>
-          <w:bCs/>
-        </w:rPr>
-        <w:t xml:space="preserve">demandez-le à votre référent thème / webmestre</w:t>
-      </w:r>
-      <w:r>
-        <w:t xml:space="preserve">.</w:t>
-      </w:r>
-    </w:p>
-    <w:bookmarkEnd w:id="120"/>
-    <w:bookmarkStart w:id="121" w:name="à-retenir-1"/>
+    <w:bookmarkStart w:id="120" w:name="à-retenir-1"/>
     <w:p>
       <w:pPr>
         <w:pStyle w:val="Heading3"/>
@@ -11070,9 +11070,9 @@
         </w:pict>
       </w:r>
     </w:p>
+    <w:bookmarkEnd w:id="120"/>
     <w:bookmarkEnd w:id="121"/>
-    <w:bookmarkEnd w:id="122"/>
-    <w:bookmarkStart w:id="134" w:name="utiliser-léditeur-de-texte"/>
+    <w:bookmarkStart w:id="133" w:name="utiliser-léditeur-de-texte"/>
     <w:p>
       <w:pPr>
         <w:pStyle w:val="Heading2"/>
@@ -11126,7 +11126,7 @@
         <w:t xml:space="preserve">Vous n’avez donc jamais à régler une couleur, une taille de police ou une graisse « à la main » : la mise en forme conforme (RGAA + DSFR) est appliquée automatiquement. Ce que vous tapez qui sortirait du cadre est simplement neutralisé à l’enregistrement — ce n’est pas un défaut, c’est la conformité qui fait son travail.</w:t>
       </w:r>
     </w:p>
-    <w:bookmarkStart w:id="126" w:name="X3ceb8c714d5d65eb1de2cc3ace355473e4ad085"/>
+    <w:bookmarkStart w:id="125" w:name="X3ceb8c714d5d65eb1de2cc3ace355473e4ad085"/>
     <w:p>
       <w:pPr>
         <w:pStyle w:val="Heading3"/>
@@ -11243,20 +11243,20 @@
       <w:r>
         <w:drawing>
           <wp:inline>
-            <wp:extent cx="5334000" cy="666750"/>
+            <wp:extent cx="5192257" cy="1150993"/>
             <wp:effectExtent b="0" l="0" r="0" t="0"/>
-            <wp:docPr descr="Bouton de bascule entre la barre d’outils simple et la barre complète" title="" id="124" name="Picture"/>
+            <wp:docPr descr="Bouton de bascule entre la barre d’outils simple et la barre complète" title="" id="123" name="Picture"/>
             <a:graphic>
               <a:graphicData uri="http://schemas.openxmlformats.org/drawingml/2006/picture">
                 <pic:pic>
                   <pic:nvPicPr>
-                    <pic:cNvPr descr="img/4a-bascule-barres.png" id="125" name="Picture"/>
+                    <pic:cNvPr descr="img/4a-bascule-barres.png" id="124" name="Picture"/>
                     <pic:cNvPicPr>
                       <a:picLocks noChangeArrowheads="1" noChangeAspect="1"/>
                     </pic:cNvPicPr>
                   </pic:nvPicPr>
                   <pic:blipFill>
-                    <a:blip r:embed="rId123"/>
+                    <a:blip r:embed="rId122"/>
                     <a:stretch>
                       <a:fillRect/>
                     </a:stretch>
@@ -11264,7 +11264,7 @@
                   <pic:spPr bwMode="auto">
                     <a:xfrm>
                       <a:off x="0" y="0"/>
-                      <a:ext cx="5334000" cy="666750"/>
+                      <a:ext cx="5192257" cy="1150993"/>
                     </a:xfrm>
                     <a:prstGeom prst="rect">
                       <a:avLst/>
@@ -11454,8 +11454,8 @@
         <w:t xml:space="preserve">sont présents dans la barre complète, quelle que soit la barre par laquelle vous avez commencé. Si vous ne les voyez pas, c’est que vous êtes en barre simple : cliquez sur le bouton de bascule.</w:t>
       </w:r>
     </w:p>
-    <w:bookmarkEnd w:id="126"/>
-    <w:bookmarkStart w:id="127" w:name="ce-que-vous-pouvez-utiliser-sans-crainte"/>
+    <w:bookmarkEnd w:id="125"/>
+    <w:bookmarkStart w:id="126" w:name="ce-que-vous-pouvez-utiliser-sans-crainte"/>
     <w:p>
       <w:pPr>
         <w:pStyle w:val="Heading3"/>
@@ -11646,171 +11646,171 @@
         <w:t xml:space="preserve">— utile pour « m² », « 1ᵉʳ », un appel de note, une formule simple. Conservé.</w:t>
       </w:r>
     </w:p>
+    <w:bookmarkEnd w:id="126"/>
+    <w:bookmarkStart w:id="127" w:name="ce-que-vous-devez-éviter"/>
+    <w:p>
+      <w:pPr>
+        <w:pStyle w:val="Heading3"/>
+      </w:pPr>
+      <w:r>
+        <w:t xml:space="preserve">5.3. Ce que vous devez éviter</w:t>
+      </w:r>
+    </w:p>
+    <w:p>
+      <w:pPr>
+        <w:pStyle w:val="FirstParagraph"/>
+      </w:pPr>
+      <w:r>
+        <w:t xml:space="preserve">Ces manipulations ne servent à rien ici : soit elles sont</w:t>
+      </w:r>
+      <w:r>
+        <w:t xml:space="preserve"> </w:t>
+      </w:r>
+      <w:r>
+        <w:rPr>
+          <w:b/>
+          <w:bCs/>
+        </w:rPr>
+        <w:t xml:space="preserve">retirées</w:t>
+      </w:r>
+      <w:r>
+        <w:t xml:space="preserve"> </w:t>
+      </w:r>
+      <w:r>
+        <w:t xml:space="preserve">à l’enregistrement, soit elles introduisent des problèmes invisibles.</w:t>
+      </w:r>
+    </w:p>
+    <w:p>
+      <w:pPr>
+        <w:pStyle w:val="Compact"/>
+        <w:numPr>
+          <w:ilvl w:val="0"/>
+          <w:numId w:val="1060"/>
+        </w:numPr>
+      </w:pPr>
+      <w:r>
+        <w:rPr>
+          <w:b/>
+          <w:bCs/>
+        </w:rPr>
+        <w:t xml:space="preserve">Couleurs de texte, tailles de police, changement de police</w:t>
+      </w:r>
+      <w:r>
+        <w:t xml:space="preserve"> </w:t>
+      </w:r>
+      <w:r>
+        <w:t xml:space="preserve">— même si un bouton semble le permettre, ces réglages manuels sont</w:t>
+      </w:r>
+      <w:r>
+        <w:t xml:space="preserve"> </w:t>
+      </w:r>
+      <w:r>
+        <w:rPr>
+          <w:b/>
+          <w:bCs/>
+        </w:rPr>
+        <w:t xml:space="preserve">retirés</w:t>
+      </w:r>
+      <w:r>
+        <w:t xml:space="preserve"> </w:t>
+      </w:r>
+      <w:r>
+        <w:t xml:space="preserve">à l’enregistrement pour garantir la conformité et la cohérence visuelle. Le contraste, la taille et la typographie sont déjà gérés par le thème DSFR. Vouloir « mettre un mot en rouge » ne fonctionnera pas ; pour signaler quelque chose d’important, utilisez plutôt un composant DSFR qui porte ce sens (une</w:t>
+      </w:r>
+      <w:r>
+        <w:t xml:space="preserve"> </w:t>
+      </w:r>
+      <w:r>
+        <w:rPr>
+          <w:b/>
+          <w:bCs/>
+        </w:rPr>
+        <w:t xml:space="preserve">mise en avant</w:t>
+      </w:r>
+      <w:r>
+        <w:t xml:space="preserve"> </w:t>
+      </w:r>
+      <w:r>
+        <w:t xml:space="preserve">ou une</w:t>
+      </w:r>
+      <w:r>
+        <w:t xml:space="preserve"> </w:t>
+      </w:r>
+      <w:r>
+        <w:rPr>
+          <w:b/>
+          <w:bCs/>
+        </w:rPr>
+        <w:t xml:space="preserve">alerte</w:t>
+      </w:r>
+      <w:r>
+        <w:t xml:space="preserve">, voir la section 6 (Mises en forme et composants DSFR)).</w:t>
+      </w:r>
+    </w:p>
+    <w:p>
+      <w:pPr>
+        <w:pStyle w:val="Compact"/>
+        <w:numPr>
+          <w:ilvl w:val="0"/>
+          <w:numId w:val="1060"/>
+        </w:numPr>
+      </w:pPr>
+      <w:r>
+        <w:rPr>
+          <w:b/>
+          <w:bCs/>
+        </w:rPr>
+        <w:t xml:space="preserve">Coller depuis Word (ou un PDF, un e-mail mis en forme)</w:t>
+      </w:r>
+      <w:r>
+        <w:t xml:space="preserve"> </w:t>
+      </w:r>
+      <w:r>
+        <w:t xml:space="preserve">— le copier-coller depuis un traitement de texte embarque un « bagage » caché de balises et de styles propriétaires. Résultat : espacements bizarres, polices qui sautent, listes cassées, et beaucoup de nettoyage.</w:t>
+      </w:r>
+      <w:r>
+        <w:t xml:space="preserve"> </w:t>
+      </w:r>
+      <w:r>
+        <w:rPr>
+          <w:b/>
+          <w:bCs/>
+        </w:rPr>
+        <w:t xml:space="preserve">Le bon réflexe : coller le texte, puis reconstruire la mise en forme dans l’éditeur</w:t>
+      </w:r>
+      <w:r>
+        <w:t xml:space="preserve"> </w:t>
+      </w:r>
+      <w:r>
+        <w:t xml:space="preserve">(listes, gras, liens). Pour coller du texte pur, utilisez le collage sans mise en forme de votre système (Ctrl+Maj+V / Cmd+Maj+V) avant de re-styler.</w:t>
+      </w:r>
+    </w:p>
+    <w:p>
+      <w:pPr>
+        <w:pStyle w:val="BlockText"/>
+      </w:pPr>
+      <w:r>
+        <w:t xml:space="preserve">Pourquoi c’est retiré et pas juste « déconseillé » ? Parce que la présentation est</w:t>
+      </w:r>
+      <w:r>
+        <w:t xml:space="preserve"> </w:t>
+      </w:r>
+      <w:r>
+        <w:rPr>
+          <w:b/>
+          <w:bCs/>
+        </w:rPr>
+        <w:t xml:space="preserve">normalisée pour vous</w:t>
+      </w:r>
+      <w:r>
+        <w:t xml:space="preserve"> </w:t>
+      </w:r>
+      <w:r>
+        <w:t xml:space="preserve">: c’est une obligation légale d’accessibilité (RGAA) et de charte (DSFR). L’éditeur vous laisse vous concentrer sur le fond ; il fait le tri sur la forme.</w:t>
+      </w:r>
+    </w:p>
     <w:bookmarkEnd w:id="127"/>
-    <w:bookmarkStart w:id="128" w:name="ce-que-vous-devez-éviter"/>
-    <w:p>
-      <w:pPr>
-        <w:pStyle w:val="Heading3"/>
-      </w:pPr>
-      <w:r>
-        <w:t xml:space="preserve">5.3. Ce que vous devez éviter</w:t>
-      </w:r>
-    </w:p>
-    <w:p>
-      <w:pPr>
-        <w:pStyle w:val="FirstParagraph"/>
-      </w:pPr>
-      <w:r>
-        <w:t xml:space="preserve">Ces manipulations ne servent à rien ici : soit elles sont</w:t>
-      </w:r>
-      <w:r>
-        <w:t xml:space="preserve"> </w:t>
-      </w:r>
-      <w:r>
-        <w:rPr>
-          <w:b/>
-          <w:bCs/>
-        </w:rPr>
-        <w:t xml:space="preserve">retirées</w:t>
-      </w:r>
-      <w:r>
-        <w:t xml:space="preserve"> </w:t>
-      </w:r>
-      <w:r>
-        <w:t xml:space="preserve">à l’enregistrement, soit elles introduisent des problèmes invisibles.</w:t>
-      </w:r>
-    </w:p>
-    <w:p>
-      <w:pPr>
-        <w:pStyle w:val="Compact"/>
-        <w:numPr>
-          <w:ilvl w:val="0"/>
-          <w:numId w:val="1060"/>
-        </w:numPr>
-      </w:pPr>
-      <w:r>
-        <w:rPr>
-          <w:b/>
-          <w:bCs/>
-        </w:rPr>
-        <w:t xml:space="preserve">Couleurs de texte, tailles de police, changement de police</w:t>
-      </w:r>
-      <w:r>
-        <w:t xml:space="preserve"> </w:t>
-      </w:r>
-      <w:r>
-        <w:t xml:space="preserve">— même si un bouton semble le permettre, ces réglages manuels sont</w:t>
-      </w:r>
-      <w:r>
-        <w:t xml:space="preserve"> </w:t>
-      </w:r>
-      <w:r>
-        <w:rPr>
-          <w:b/>
-          <w:bCs/>
-        </w:rPr>
-        <w:t xml:space="preserve">retirés</w:t>
-      </w:r>
-      <w:r>
-        <w:t xml:space="preserve"> </w:t>
-      </w:r>
-      <w:r>
-        <w:t xml:space="preserve">à l’enregistrement pour garantir la conformité et la cohérence visuelle. Le contraste, la taille et la typographie sont déjà gérés par le thème DSFR. Vouloir « mettre un mot en rouge » ne fonctionnera pas ; pour signaler quelque chose d’important, utilisez plutôt un composant DSFR qui porte ce sens (une</w:t>
-      </w:r>
-      <w:r>
-        <w:t xml:space="preserve"> </w:t>
-      </w:r>
-      <w:r>
-        <w:rPr>
-          <w:b/>
-          <w:bCs/>
-        </w:rPr>
-        <w:t xml:space="preserve">mise en avant</w:t>
-      </w:r>
-      <w:r>
-        <w:t xml:space="preserve"> </w:t>
-      </w:r>
-      <w:r>
-        <w:t xml:space="preserve">ou une</w:t>
-      </w:r>
-      <w:r>
-        <w:t xml:space="preserve"> </w:t>
-      </w:r>
-      <w:r>
-        <w:rPr>
-          <w:b/>
-          <w:bCs/>
-        </w:rPr>
-        <w:t xml:space="preserve">alerte</w:t>
-      </w:r>
-      <w:r>
-        <w:t xml:space="preserve">, voir la section 6 (Mises en forme et composants DSFR)).</w:t>
-      </w:r>
-    </w:p>
-    <w:p>
-      <w:pPr>
-        <w:pStyle w:val="Compact"/>
-        <w:numPr>
-          <w:ilvl w:val="0"/>
-          <w:numId w:val="1060"/>
-        </w:numPr>
-      </w:pPr>
-      <w:r>
-        <w:rPr>
-          <w:b/>
-          <w:bCs/>
-        </w:rPr>
-        <w:t xml:space="preserve">Coller depuis Word (ou un PDF, un e-mail mis en forme)</w:t>
-      </w:r>
-      <w:r>
-        <w:t xml:space="preserve"> </w:t>
-      </w:r>
-      <w:r>
-        <w:t xml:space="preserve">— le copier-coller depuis un traitement de texte embarque un « bagage » caché de balises et de styles propriétaires. Résultat : espacements bizarres, polices qui sautent, listes cassées, et beaucoup de nettoyage.</w:t>
-      </w:r>
-      <w:r>
-        <w:t xml:space="preserve"> </w:t>
-      </w:r>
-      <w:r>
-        <w:rPr>
-          <w:b/>
-          <w:bCs/>
-        </w:rPr>
-        <w:t xml:space="preserve">Le bon réflexe : coller le texte, puis reconstruire la mise en forme dans l’éditeur</w:t>
-      </w:r>
-      <w:r>
-        <w:t xml:space="preserve"> </w:t>
-      </w:r>
-      <w:r>
-        <w:t xml:space="preserve">(listes, gras, liens). Pour coller du texte pur, utilisez le collage sans mise en forme de votre système (Ctrl+Maj+V / Cmd+Maj+V) avant de re-styler.</w:t>
-      </w:r>
-    </w:p>
-    <w:p>
-      <w:pPr>
-        <w:pStyle w:val="BlockText"/>
-      </w:pPr>
-      <w:r>
-        <w:t xml:space="preserve">Pourquoi c’est retiré et pas juste « déconseillé » ? Parce que la présentation est</w:t>
-      </w:r>
-      <w:r>
-        <w:t xml:space="preserve"> </w:t>
-      </w:r>
-      <w:r>
-        <w:rPr>
-          <w:b/>
-          <w:bCs/>
-        </w:rPr>
-        <w:t xml:space="preserve">normalisée pour vous</w:t>
-      </w:r>
-      <w:r>
-        <w:t xml:space="preserve"> </w:t>
-      </w:r>
-      <w:r>
-        <w:t xml:space="preserve">: c’est une obligation légale d’accessibilité (RGAA) et de charte (DSFR). L’éditeur vous laisse vous concentrer sur le fond ; il fait le tri sur la forme.</w:t>
-      </w:r>
-    </w:p>
-    <w:bookmarkEnd w:id="128"/>
-    <w:bookmarkStart w:id="132" w:name="X3d32664a55691b813f4c74902c0b78359771273"/>
+    <w:bookmarkStart w:id="131" w:name="X3d32664a55691b813f4c74902c0b78359771273"/>
     <w:p>
       <w:pPr>
         <w:pStyle w:val="Heading3"/>
@@ -11932,20 +11932,20 @@
       <w:r>
         <w:drawing>
           <wp:inline>
-            <wp:extent cx="5334000" cy="4867150"/>
+            <wp:extent cx="5334000" cy="2039333"/>
             <wp:effectExtent b="0" l="0" r="0" t="0"/>
-            <wp:docPr descr="Éditeur en mode source affichant le contenu sous sa forme technique" title="" id="130" name="Picture"/>
+            <wp:docPr descr="Éditeur en mode source affichant le contenu sous sa forme technique" title="" id="129" name="Picture"/>
             <a:graphic>
               <a:graphicData uri="http://schemas.openxmlformats.org/drawingml/2006/picture">
                 <pic:pic>
                   <pic:nvPicPr>
-                    <pic:cNvPr descr="img/4b-mode-source.png" id="131" name="Picture"/>
+                    <pic:cNvPr descr="img/4b-mode-source.png" id="130" name="Picture"/>
                     <pic:cNvPicPr>
                       <a:picLocks noChangeArrowheads="1" noChangeAspect="1"/>
                     </pic:cNvPicPr>
                   </pic:nvPicPr>
                   <pic:blipFill>
-                    <a:blip r:embed="rId129"/>
+                    <a:blip r:embed="rId128"/>
                     <a:stretch>
                       <a:fillRect/>
                     </a:stretch>
@@ -11953,7 +11953,7 @@
                   <pic:spPr bwMode="auto">
                     <a:xfrm>
                       <a:off x="0" y="0"/>
-                      <a:ext cx="5334000" cy="4867150"/>
+                      <a:ext cx="5334000" cy="2039333"/>
                     </a:xfrm>
                     <a:prstGeom prst="rect">
                       <a:avLst/>
@@ -11980,8 +11980,8 @@
         <w:t xml:space="preserve">Éditeur en mode source affichant le contenu sous sa forme technique</w:t>
       </w:r>
     </w:p>
-    <w:bookmarkEnd w:id="132"/>
-    <w:bookmarkStart w:id="133" w:name="récapitulatif-conservé-ou-normalisé"/>
+    <w:bookmarkEnd w:id="131"/>
+    <w:bookmarkStart w:id="132" w:name="récapitulatif-conservé-ou-normalisé"/>
     <w:p>
       <w:pPr>
         <w:pStyle w:val="Heading3"/>
@@ -12347,9 +12347,9 @@
         </w:pict>
       </w:r>
     </w:p>
+    <w:bookmarkEnd w:id="132"/>
     <w:bookmarkEnd w:id="133"/>
-    <w:bookmarkEnd w:id="134"/>
-    <w:bookmarkStart w:id="158" w:name="mises-en-forme-et-composants-dsfr"/>
+    <w:bookmarkStart w:id="153" w:name="mises-en-forme-et-composants-dsfr"/>
     <w:p>
       <w:pPr>
         <w:pStyle w:val="Heading2"/>
@@ -12535,7 +12535,7 @@
         <w:t xml:space="preserve">de la question. Le libellé de question s’affiche comme un titre : tout composant que vous y colleriez serait détruit. Voir la section 3 (Créer un questionnaire).</w:t>
       </w:r>
     </w:p>
-    <w:bookmarkStart w:id="141" w:name="X164abc0b9dd5f3934d5471c2d820f23ea67311d"/>
+    <w:bookmarkStart w:id="139" w:name="X164abc0b9dd5f3934d5471c2d820f23ea67311d"/>
     <w:p>
       <w:pPr>
         <w:pStyle w:val="Heading3"/>
@@ -12575,20 +12575,20 @@
       <w:r>
         <w:drawing>
           <wp:inline>
-            <wp:extent cx="2692400" cy="4470400"/>
+            <wp:extent cx="2851904" cy="3363457"/>
             <wp:effectExtent b="0" l="0" r="0" t="0"/>
-            <wp:docPr descr="Le menu déroulant Styles ouvert dans la barre d’outils de l’éditeur" title="" id="136" name="Picture"/>
+            <wp:docPr descr="Le menu déroulant Styles ouvert dans la barre d’outils de l’éditeur" title="" id="134" name="Picture"/>
             <a:graphic>
               <a:graphicData uri="http://schemas.openxmlformats.org/drawingml/2006/picture">
                 <pic:pic>
                   <pic:nvPicPr>
-                    <pic:cNvPr descr="img/c5-menu-styles.png" id="137" name="Picture"/>
+                    <pic:cNvPr descr="img/3bis-menu-styles-titres.png" id="135" name="Picture"/>
                     <pic:cNvPicPr>
                       <a:picLocks noChangeArrowheads="1" noChangeAspect="1"/>
                     </pic:cNvPicPr>
                   </pic:nvPicPr>
                   <pic:blipFill>
-                    <a:blip r:embed="rId135"/>
+                    <a:blip r:embed="rId111"/>
                     <a:stretch>
                       <a:fillRect/>
                     </a:stretch>
@@ -12596,7 +12596,7 @@
                   <pic:spPr bwMode="auto">
                     <a:xfrm>
                       <a:off x="0" y="0"/>
-                      <a:ext cx="2692400" cy="4470400"/>
+                      <a:ext cx="2851904" cy="3363457"/>
                     </a:xfrm>
                     <a:prstGeom prst="rect">
                       <a:avLst/>
@@ -12623,7 +12623,7 @@
         <w:t xml:space="preserve">Le menu déroulant Styles ouvert dans la barre d’outils de l’éditeur</w:t>
       </w:r>
     </w:p>
-    <w:bookmarkStart w:id="138" w:name="Xc0fc75d817214d166a1b902cbfa0b8097f6a840"/>
+    <w:bookmarkStart w:id="136" w:name="Xc0fc75d817214d166a1b902cbfa0b8097f6a840"/>
     <w:p>
       <w:pPr>
         <w:pStyle w:val="Heading4"/>
@@ -12735,8 +12735,8 @@
         <w:t xml:space="preserve">, et cohérent avec le reste des sites de l’État.</w:t>
       </w:r>
     </w:p>
-    <w:bookmarkEnd w:id="138"/>
-    <w:bookmarkStart w:id="139" w:name="les-styles-disponibles"/>
+    <w:bookmarkEnd w:id="136"/>
+    <w:bookmarkStart w:id="137" w:name="les-styles-disponibles"/>
     <w:p>
       <w:pPr>
         <w:pStyle w:val="Heading4"/>
@@ -13000,8 +13000,8 @@
         </w:tc>
       </w:tr>
     </w:tbl>
-    <w:bookmarkEnd w:id="139"/>
-    <w:bookmarkStart w:id="140" w:name="X90e7f79d81894d3f1b7d630755980d0ccaee4e9"/>
+    <w:bookmarkEnd w:id="137"/>
+    <w:bookmarkStart w:id="138" w:name="X90e7f79d81894d3f1b7d630755980d0ccaee4e9"/>
     <w:p>
       <w:pPr>
         <w:pStyle w:val="Heading4"/>
@@ -13395,9 +13395,9 @@
         <w:t xml:space="preserve">: s’il y en a partout, il ne signale plus rien.</w:t>
       </w:r>
     </w:p>
-    <w:bookmarkEnd w:id="140"/>
-    <w:bookmarkEnd w:id="141"/>
-    <w:bookmarkStart w:id="145" w:name="X4ec2c779e94c81fdb1ed95dd71ce6c73cc11a17"/>
+    <w:bookmarkEnd w:id="138"/>
+    <w:bookmarkEnd w:id="139"/>
+    <w:bookmarkStart w:id="143" w:name="X4ec2c779e94c81fdb1ed95dd71ce6c73cc11a17"/>
     <w:p>
       <w:pPr>
         <w:pStyle w:val="Heading3"/>
@@ -13469,20 +13469,20 @@
       <w:r>
         <w:drawing>
           <wp:inline>
-            <wp:extent cx="3378200" cy="5638800"/>
+            <wp:extent cx="4258674" cy="7583765"/>
             <wp:effectExtent b="0" l="0" r="0" t="0"/>
-            <wp:docPr descr="La palette Modèles ouverte, avec la liste des composants DSFR disponibles" title="" id="143" name="Picture"/>
+            <wp:docPr descr="La palette Modèles ouverte, avec la liste des composants DSFR disponibles" title="" id="141" name="Picture"/>
             <a:graphic>
               <a:graphicData uri="http://schemas.openxmlformats.org/drawingml/2006/picture">
                 <pic:pic>
                   <pic:nvPicPr>
-                    <pic:cNvPr descr="img/c5-palette-templates.png" id="144" name="Picture"/>
+                    <pic:cNvPr descr="img/annexeB-palette.png" id="142" name="Picture"/>
                     <pic:cNvPicPr>
                       <a:picLocks noChangeArrowheads="1" noChangeAspect="1"/>
                     </pic:cNvPicPr>
                   </pic:nvPicPr>
                   <pic:blipFill>
-                    <a:blip r:embed="rId142"/>
+                    <a:blip r:embed="rId140"/>
                     <a:stretch>
                       <a:fillRect/>
                     </a:stretch>
@@ -13490,7 +13490,7 @@
                   <pic:spPr bwMode="auto">
                     <a:xfrm>
                       <a:off x="0" y="0"/>
-                      <a:ext cx="3378200" cy="5638800"/>
+                      <a:ext cx="4258674" cy="7583765"/>
                     </a:xfrm>
                     <a:prstGeom prst="rect">
                       <a:avLst/>
@@ -13745,8 +13745,8 @@
         <w:t xml:space="preserve">.</w:t>
       </w:r>
     </w:p>
-    <w:bookmarkEnd w:id="145"/>
-    <w:bookmarkStart w:id="156" w:name="le-sens-de-chaque-composant"/>
+    <w:bookmarkEnd w:id="143"/>
+    <w:bookmarkStart w:id="151" w:name="le-sens-de-chaque-composant"/>
     <w:p>
       <w:pPr>
         <w:pStyle w:val="Heading3"/>
@@ -13755,7 +13755,7 @@
         <w:t xml:space="preserve">6.3. Le sens de chaque composant</w:t>
       </w:r>
     </w:p>
-    <w:bookmarkStart w:id="146" w:name="Xf896c9e02c842e1cab53c942c8042061b683b8b"/>
+    <w:bookmarkStart w:id="144" w:name="Xf896c9e02c842e1cab53c942c8042061b683b8b"/>
     <w:p>
       <w:pPr>
         <w:pStyle w:val="Heading4"/>
@@ -14203,8 +14203,8 @@
         <w:t xml:space="preserve">.</w:t>
       </w:r>
     </w:p>
-    <w:bookmarkEnd w:id="146"/>
-    <w:bookmarkStart w:id="147" w:name="X471364c682a1899178044806c956d2de125d58e"/>
+    <w:bookmarkEnd w:id="144"/>
+    <w:bookmarkStart w:id="145" w:name="X471364c682a1899178044806c956d2de125d58e"/>
     <w:p>
       <w:pPr>
         <w:pStyle w:val="Heading4"/>
@@ -14711,14 +14711,593 @@
         <w:t xml:space="preserve">(mise en avant ou mise en exergue).</w:t>
       </w:r>
     </w:p>
+    <w:bookmarkEnd w:id="145"/>
+    <w:bookmarkStart w:id="146" w:name="Xdf41ef36dbcce782e9da6777cd3f1446b1b071c"/>
+    <w:p>
+      <w:pPr>
+        <w:pStyle w:val="Heading4"/>
+      </w:pPr>
+      <w:r>
+        <w:t xml:space="preserve">Mise en avant — une information importante et stable</w:t>
+      </w:r>
+    </w:p>
+    <w:p>
+      <w:pPr>
+        <w:pStyle w:val="FirstParagraph"/>
+      </w:pPr>
+      <w:r>
+        <w:t xml:space="preserve">Composant qui attire l’attention sur une information</w:t>
+      </w:r>
+      <w:r>
+        <w:t xml:space="preserve"> </w:t>
+      </w:r>
+      <w:r>
+        <w:rPr>
+          <w:b/>
+          <w:bCs/>
+        </w:rPr>
+        <w:t xml:space="preserve">importante et utile</w:t>
+      </w:r>
+      <w:r>
+        <w:t xml:space="preserve">, complémentaire au contenu principal,</w:t>
+      </w:r>
+      <w:r>
+        <w:t xml:space="preserve"> </w:t>
+      </w:r>
+      <w:r>
+        <w:rPr>
+          <w:b/>
+          <w:bCs/>
+        </w:rPr>
+        <w:t xml:space="preserve">sans le caractère d’urgence</w:t>
+      </w:r>
+      <w:r>
+        <w:t xml:space="preserve"> </w:t>
+      </w:r>
+      <w:r>
+        <w:t xml:space="preserve">d’une alerte. Il contient un</w:t>
+      </w:r>
+      <w:r>
+        <w:t xml:space="preserve"> </w:t>
+      </w:r>
+      <w:r>
+        <w:rPr>
+          <w:b/>
+          <w:bCs/>
+        </w:rPr>
+        <w:t xml:space="preserve">titre et un texte</w:t>
+      </w:r>
+      <w:r>
+        <w:t xml:space="preserve">. Deux variantes :</w:t>
+      </w:r>
+      <w:r>
+        <w:t xml:space="preserve"> </w:t>
+      </w:r>
+      <w:r>
+        <w:rPr>
+          <w:b/>
+          <w:bCs/>
+        </w:rPr>
+        <w:t xml:space="preserve">avec titre</w:t>
+      </w:r>
+      <w:r>
+        <w:t xml:space="preserve"> </w:t>
+      </w:r>
+      <w:r>
+        <w:t xml:space="preserve">(mise en avant autonome) ou</w:t>
+      </w:r>
+      <w:r>
+        <w:t xml:space="preserve"> </w:t>
+      </w:r>
+      <w:r>
+        <w:rPr>
+          <w:b/>
+          <w:bCs/>
+        </w:rPr>
+        <w:t xml:space="preserve">sans titre</w:t>
+      </w:r>
+      <w:r>
+        <w:t xml:space="preserve"> </w:t>
+      </w:r>
+      <w:r>
+        <w:t xml:space="preserve">(texte seul).</w:t>
+      </w:r>
+    </w:p>
+    <w:p>
+      <w:pPr>
+        <w:pStyle w:val="Compact"/>
+        <w:numPr>
+          <w:ilvl w:val="0"/>
+          <w:numId w:val="1071"/>
+        </w:numPr>
+      </w:pPr>
+      <w:r>
+        <w:rPr>
+          <w:b/>
+          <w:bCs/>
+        </w:rPr>
+        <w:t xml:space="preserve">À utiliser pour</w:t>
+      </w:r>
+      <w:r>
+        <w:t xml:space="preserve"> </w:t>
+      </w:r>
+      <w:r>
+        <w:t xml:space="preserve">: rappeler une</w:t>
+      </w:r>
+      <w:r>
+        <w:t xml:space="preserve"> </w:t>
+      </w:r>
+      <w:r>
+        <w:rPr>
+          <w:b/>
+          <w:bCs/>
+        </w:rPr>
+        <w:t xml:space="preserve">consigne clé</w:t>
+      </w:r>
+      <w:r>
+        <w:t xml:space="preserve"> </w:t>
+      </w:r>
+      <w:r>
+        <w:t xml:space="preserve">avant un module de questions (« Répondez en pensant aux 12 derniers mois ») ; donner un</w:t>
+      </w:r>
+      <w:r>
+        <w:t xml:space="preserve"> </w:t>
+      </w:r>
+      <w:r>
+        <w:rPr>
+          <w:b/>
+          <w:bCs/>
+        </w:rPr>
+        <w:t xml:space="preserve">contexte rassurant</w:t>
+      </w:r>
+      <w:r>
+        <w:t xml:space="preserve"> </w:t>
+      </w:r>
+      <w:r>
+        <w:t xml:space="preserve">(durée estimée, anonymat, reprise possible) ; signaler une information</w:t>
+      </w:r>
+      <w:r>
+        <w:t xml:space="preserve"> </w:t>
+      </w:r>
+      <w:r>
+        <w:rPr>
+          <w:b/>
+          <w:bCs/>
+        </w:rPr>
+        <w:t xml:space="preserve">notable mais non urgente</w:t>
+      </w:r>
+      <w:r>
+        <w:t xml:space="preserve">.</w:t>
+      </w:r>
+    </w:p>
+    <w:p>
+      <w:pPr>
+        <w:pStyle w:val="Compact"/>
+        <w:numPr>
+          <w:ilvl w:val="0"/>
+          <w:numId w:val="1071"/>
+        </w:numPr>
+      </w:pPr>
+      <w:r>
+        <w:rPr>
+          <w:b/>
+          <w:bCs/>
+        </w:rPr>
+        <w:t xml:space="preserve">À NE PAS utiliser pour</w:t>
+      </w:r>
+      <w:r>
+        <w:t xml:space="preserve"> </w:t>
+      </w:r>
+      <w:r>
+        <w:t xml:space="preserve">: une</w:t>
+      </w:r>
+      <w:r>
+        <w:t xml:space="preserve"> </w:t>
+      </w:r>
+      <w:r>
+        <w:rPr>
+          <w:b/>
+          <w:bCs/>
+        </w:rPr>
+        <w:t xml:space="preserve">erreur / succès / info urgente</w:t>
+      </w:r>
+      <w:r>
+        <w:t xml:space="preserve"> </w:t>
+      </w:r>
+      <w:r>
+        <w:t xml:space="preserve">(→ Alerte) ; une</w:t>
+      </w:r>
+      <w:r>
+        <w:t xml:space="preserve"> </w:t>
+      </w:r>
+      <w:r>
+        <w:rPr>
+          <w:b/>
+          <w:bCs/>
+        </w:rPr>
+        <w:t xml:space="preserve">citation</w:t>
+      </w:r>
+      <w:r>
+        <w:t xml:space="preserve"> </w:t>
+      </w:r>
+      <w:r>
+        <w:t xml:space="preserve">(→ Citation) ; une</w:t>
+      </w:r>
+      <w:r>
+        <w:t xml:space="preserve"> </w:t>
+      </w:r>
+      <w:r>
+        <w:rPr>
+          <w:b/>
+          <w:bCs/>
+        </w:rPr>
+        <w:t xml:space="preserve">FAQ</w:t>
+      </w:r>
+      <w:r>
+        <w:t xml:space="preserve"> </w:t>
+      </w:r>
+      <w:r>
+        <w:t xml:space="preserve">repliable (→ Accordéon) ; un simple</w:t>
+      </w:r>
+      <w:r>
+        <w:t xml:space="preserve"> </w:t>
+      </w:r>
+      <w:r>
+        <w:rPr>
+          <w:b/>
+          <w:bCs/>
+        </w:rPr>
+        <w:t xml:space="preserve">encadré coloré « pour faire joli »</w:t>
+      </w:r>
+      <w:r>
+        <w:t xml:space="preserve">.</w:t>
+      </w:r>
+    </w:p>
+    <w:p>
+      <w:pPr>
+        <w:pStyle w:val="Compact"/>
+        <w:numPr>
+          <w:ilvl w:val="0"/>
+          <w:numId w:val="1071"/>
+        </w:numPr>
+      </w:pPr>
+      <w:r>
+        <w:rPr>
+          <w:b/>
+          <w:bCs/>
+        </w:rPr>
+        <w:t xml:space="preserve">Bonnes pratiques</w:t>
+      </w:r>
+      <w:r>
+        <w:t xml:space="preserve"> </w:t>
+      </w:r>
+      <w:r>
+        <w:t xml:space="preserve">: sa force tient à sa</w:t>
+      </w:r>
+      <w:r>
+        <w:t xml:space="preserve"> </w:t>
+      </w:r>
+      <w:r>
+        <w:rPr>
+          <w:b/>
+          <w:bCs/>
+        </w:rPr>
+        <w:t xml:space="preserve">rareté</w:t>
+      </w:r>
+      <w:r>
+        <w:t xml:space="preserve"> </w:t>
+      </w:r>
+      <w:r>
+        <w:t xml:space="preserve">—</w:t>
+      </w:r>
+      <w:r>
+        <w:t xml:space="preserve"> </w:t>
+      </w:r>
+      <w:r>
+        <w:rPr>
+          <w:b/>
+          <w:bCs/>
+        </w:rPr>
+        <w:t xml:space="preserve">une, exceptionnellement deux</w:t>
+      </w:r>
+      <w:r>
+        <w:t xml:space="preserve"> </w:t>
+      </w:r>
+      <w:r>
+        <w:t xml:space="preserve">par page. Titre court, texte concis (2–3 phrases,</w:t>
+      </w:r>
+      <w:r>
+        <w:t xml:space="preserve"> </w:t>
+      </w:r>
+      <w:r>
+        <w:rPr>
+          <w:b/>
+          <w:bCs/>
+        </w:rPr>
+        <w:t xml:space="preserve">une seule idée</w:t>
+      </w:r>
+      <w:r>
+        <w:t xml:space="preserve">).</w:t>
+      </w:r>
+    </w:p>
+    <w:bookmarkEnd w:id="146"/>
+    <w:bookmarkStart w:id="147" w:name="X2f01da74a2c1ebc75f2da39eab28ef0f8ff8fc8"/>
+    <w:p>
+      <w:pPr>
+        <w:pStyle w:val="Heading4"/>
+      </w:pPr>
+      <w:r>
+        <w:t xml:space="preserve">Mise en exergue — faire ressortir un court passage clé</w:t>
+      </w:r>
+    </w:p>
+    <w:p>
+      <w:pPr>
+        <w:pStyle w:val="FirstParagraph"/>
+      </w:pPr>
+      <w:r>
+        <w:t xml:space="preserve">La mise en exergue détache un</w:t>
+      </w:r>
+      <w:r>
+        <w:t xml:space="preserve"> </w:t>
+      </w:r>
+      <w:r>
+        <w:rPr>
+          <w:b/>
+          <w:bCs/>
+        </w:rPr>
+        <w:t xml:space="preserve">court passage de texte réellement important</w:t>
+      </w:r>
+      <w:r>
+        <w:t xml:space="preserve"> </w:t>
+      </w:r>
+      <w:r>
+        <w:t xml:space="preserve">par un</w:t>
+      </w:r>
+      <w:r>
+        <w:t xml:space="preserve"> </w:t>
+      </w:r>
+      <w:r>
+        <w:rPr>
+          <w:b/>
+          <w:bCs/>
+        </w:rPr>
+        <w:t xml:space="preserve">liseré vertical coloré</w:t>
+      </w:r>
+      <w:r>
+        <w:t xml:space="preserve">, sans changer son sens ni sonner l’alerte.</w:t>
+      </w:r>
+    </w:p>
+    <w:p>
+      <w:pPr>
+        <w:pStyle w:val="Compact"/>
+        <w:numPr>
+          <w:ilvl w:val="0"/>
+          <w:numId w:val="1072"/>
+        </w:numPr>
+      </w:pPr>
+      <w:r>
+        <w:rPr>
+          <w:b/>
+          <w:bCs/>
+        </w:rPr>
+        <w:t xml:space="preserve">À utiliser pour</w:t>
+      </w:r>
+      <w:r>
+        <w:t xml:space="preserve"> </w:t>
+      </w:r>
+      <w:r>
+        <w:t xml:space="preserve">: souligner une</w:t>
+      </w:r>
+      <w:r>
+        <w:t xml:space="preserve"> </w:t>
+      </w:r>
+      <w:r>
+        <w:rPr>
+          <w:b/>
+          <w:bCs/>
+        </w:rPr>
+        <w:t xml:space="preserve">information clé</w:t>
+      </w:r>
+      <w:r>
+        <w:t xml:space="preserve"> </w:t>
+      </w:r>
+      <w:r>
+        <w:t xml:space="preserve">dans une introduction ou une consigne (« Vos réponses restent anonymes ») ; une phrase-pivot à lire avant de commencer ; aérer un texte dense en isolant l’idée directrice.</w:t>
+      </w:r>
+    </w:p>
+    <w:p>
+      <w:pPr>
+        <w:pStyle w:val="Compact"/>
+        <w:numPr>
+          <w:ilvl w:val="0"/>
+          <w:numId w:val="1072"/>
+        </w:numPr>
+      </w:pPr>
+      <w:r>
+        <w:rPr>
+          <w:b/>
+          <w:bCs/>
+        </w:rPr>
+        <w:t xml:space="preserve">À NE PAS utiliser pour</w:t>
+      </w:r>
+      <w:r>
+        <w:t xml:space="preserve"> </w:t>
+      </w:r>
+      <w:r>
+        <w:t xml:space="preserve">: une</w:t>
+      </w:r>
+      <w:r>
+        <w:t xml:space="preserve"> </w:t>
+      </w:r>
+      <w:r>
+        <w:rPr>
+          <w:b/>
+          <w:bCs/>
+        </w:rPr>
+        <w:t xml:space="preserve">erreur / info critique temporaire</w:t>
+      </w:r>
+      <w:r>
+        <w:t xml:space="preserve"> </w:t>
+      </w:r>
+      <w:r>
+        <w:t xml:space="preserve">(→ Alerte) ; une</w:t>
+      </w:r>
+      <w:r>
+        <w:t xml:space="preserve"> </w:t>
+      </w:r>
+      <w:r>
+        <w:rPr>
+          <w:b/>
+          <w:bCs/>
+        </w:rPr>
+        <w:t xml:space="preserve">parole attribuée</w:t>
+      </w:r>
+      <w:r>
+        <w:t xml:space="preserve"> </w:t>
+      </w:r>
+      <w:r>
+        <w:t xml:space="preserve">(→ Citation) ;</w:t>
+      </w:r>
+      <w:r>
+        <w:t xml:space="preserve"> </w:t>
+      </w:r>
+      <w:r>
+        <w:rPr>
+          <w:b/>
+          <w:bCs/>
+        </w:rPr>
+        <w:t xml:space="preserve">décorer</w:t>
+      </w:r>
+      <w:r>
+        <w:t xml:space="preserve"> </w:t>
+      </w:r>
+      <w:r>
+        <w:t xml:space="preserve">la page ; encadrer de</w:t>
+      </w:r>
+      <w:r>
+        <w:t xml:space="preserve"> </w:t>
+      </w:r>
+      <w:r>
+        <w:rPr>
+          <w:b/>
+          <w:bCs/>
+        </w:rPr>
+        <w:t xml:space="preserve">longs blocs</w:t>
+      </w:r>
+      <w:r>
+        <w:t xml:space="preserve"> </w:t>
+      </w:r>
+      <w:r>
+        <w:t xml:space="preserve">ou</w:t>
+      </w:r>
+      <w:r>
+        <w:t xml:space="preserve"> </w:t>
+      </w:r>
+      <w:r>
+        <w:rPr>
+          <w:b/>
+          <w:bCs/>
+        </w:rPr>
+        <w:t xml:space="preserve">empiler</w:t>
+      </w:r>
+      <w:r>
+        <w:t xml:space="preserve"> </w:t>
+      </w:r>
+      <w:r>
+        <w:t xml:space="preserve">les exergues.</w:t>
+      </w:r>
+    </w:p>
+    <w:p>
+      <w:pPr>
+        <w:pStyle w:val="Compact"/>
+        <w:numPr>
+          <w:ilvl w:val="0"/>
+          <w:numId w:val="1072"/>
+        </w:numPr>
+      </w:pPr>
+      <w:r>
+        <w:rPr>
+          <w:b/>
+          <w:bCs/>
+        </w:rPr>
+        <w:t xml:space="preserve">Bonnes pratiques</w:t>
+      </w:r>
+      <w:r>
+        <w:t xml:space="preserve"> </w:t>
+      </w:r>
+      <w:r>
+        <w:t xml:space="preserve">: une à trois phrases, rédigées comme un</w:t>
+      </w:r>
+      <w:r>
+        <w:t xml:space="preserve"> </w:t>
+      </w:r>
+      <w:r>
+        <w:rPr>
+          <w:b/>
+          <w:bCs/>
+        </w:rPr>
+        <w:t xml:space="preserve">message autoportant</w:t>
+      </w:r>
+      <w:r>
+        <w:t xml:space="preserve"> </w:t>
+      </w:r>
+      <w:r>
+        <w:t xml:space="preserve">;</w:t>
+      </w:r>
+      <w:r>
+        <w:t xml:space="preserve"> </w:t>
+      </w:r>
+      <w:r>
+        <w:rPr>
+          <w:b/>
+          <w:bCs/>
+        </w:rPr>
+        <w:t xml:space="preserve">une seule</w:t>
+      </w:r>
+      <w:r>
+        <w:t xml:space="preserve"> </w:t>
+      </w:r>
+      <w:r>
+        <w:t xml:space="preserve">(au maximum deux) par écran. Évitez le gras et les majuscules à l’intérieur — le liseré suffit déjà à hiérarchiser. Dans le doute : « est-ce un état / une action à corriger ? » →</w:t>
+      </w:r>
+      <w:r>
+        <w:t xml:space="preserve"> </w:t>
+      </w:r>
+      <w:r>
+        <w:rPr>
+          <w:b/>
+          <w:bCs/>
+        </w:rPr>
+        <w:t xml:space="preserve">Alerte</w:t>
+      </w:r>
+      <w:r>
+        <w:t xml:space="preserve"> </w:t>
+      </w:r>
+      <w:r>
+        <w:t xml:space="preserve">; « est-ce une information de fond à retenir ? » →</w:t>
+      </w:r>
+      <w:r>
+        <w:t xml:space="preserve"> </w:t>
+      </w:r>
+      <w:r>
+        <w:rPr>
+          <w:b/>
+          <w:bCs/>
+        </w:rPr>
+        <w:t xml:space="preserve">Mise en exergue</w:t>
+      </w:r>
+      <w:r>
+        <w:t xml:space="preserve">.</w:t>
+      </w:r>
+    </w:p>
     <w:bookmarkEnd w:id="147"/>
-    <w:bookmarkStart w:id="148" w:name="Xdf41ef36dbcce782e9da6777cd3f1446b1b071c"/>
+    <w:bookmarkStart w:id="148" w:name="X303b59db22d0d1de2e94c96047ce3a1bf88aebd"/>
     <w:p>
       <w:pPr>
         <w:pStyle w:val="Heading4"/>
       </w:pPr>
       <w:r>
-        <w:t xml:space="preserve">Mise en avant — une information importante et stable</w:t>
+        <w:t xml:space="preserve">Citation — une parole rapportée, attribuée à son auteur</w:t>
       </w:r>
     </w:p>
     <w:p>
@@ -14726,89 +15305,63 @@
         <w:pStyle w:val="FirstParagraph"/>
       </w:pPr>
       <w:r>
-        <w:t xml:space="preserve">Composant qui attire l’attention sur une information</w:t>
-      </w:r>
-      <w:r>
-        <w:t xml:space="preserve"> </w:t>
-      </w:r>
-      <w:r>
-        <w:rPr>
-          <w:b/>
-          <w:bCs/>
-        </w:rPr>
-        <w:t xml:space="preserve">importante et utile</w:t>
-      </w:r>
-      <w:r>
-        <w:t xml:space="preserve">, complémentaire au contenu principal,</w:t>
-      </w:r>
-      <w:r>
-        <w:t xml:space="preserve"> </w:t>
-      </w:r>
-      <w:r>
-        <w:rPr>
-          <w:b/>
-          <w:bCs/>
-        </w:rPr>
-        <w:t xml:space="preserve">sans le caractère d’urgence</w:t>
-      </w:r>
-      <w:r>
-        <w:t xml:space="preserve"> </w:t>
-      </w:r>
-      <w:r>
-        <w:t xml:space="preserve">d’une alerte. Il contient un</w:t>
-      </w:r>
-      <w:r>
-        <w:t xml:space="preserve"> </w:t>
-      </w:r>
-      <w:r>
-        <w:rPr>
-          <w:b/>
-          <w:bCs/>
-        </w:rPr>
-        <w:t xml:space="preserve">titre et un texte</w:t>
-      </w:r>
-      <w:r>
-        <w:t xml:space="preserve">. Deux variantes :</w:t>
-      </w:r>
-      <w:r>
-        <w:t xml:space="preserve"> </w:t>
-      </w:r>
-      <w:r>
-        <w:rPr>
-          <w:b/>
-          <w:bCs/>
-        </w:rPr>
-        <w:t xml:space="preserve">avec titre</w:t>
-      </w:r>
-      <w:r>
-        <w:t xml:space="preserve"> </w:t>
-      </w:r>
-      <w:r>
-        <w:t xml:space="preserve">(mise en avant autonome) ou</w:t>
-      </w:r>
-      <w:r>
-        <w:t xml:space="preserve"> </w:t>
-      </w:r>
-      <w:r>
-        <w:rPr>
-          <w:b/>
-          <w:bCs/>
-        </w:rPr>
-        <w:t xml:space="preserve">sans titre</w:t>
-      </w:r>
-      <w:r>
-        <w:t xml:space="preserve"> </w:t>
-      </w:r>
-      <w:r>
-        <w:t xml:space="preserve">(texte seul).</w:t>
-      </w:r>
-    </w:p>
-    <w:p>
-      <w:pPr>
-        <w:pStyle w:val="Compact"/>
-        <w:numPr>
-          <w:ilvl w:val="0"/>
-          <w:numId w:val="1071"/>
+        <w:t xml:space="preserve">La citation met en valeur les</w:t>
+      </w:r>
+      <w:r>
+        <w:t xml:space="preserve"> </w:t>
+      </w:r>
+      <w:r>
+        <w:rPr>
+          <w:b/>
+          <w:bCs/>
+        </w:rPr>
+        <w:t xml:space="preserve">propos exacts</w:t>
+      </w:r>
+      <w:r>
+        <w:t xml:space="preserve"> </w:t>
+      </w:r>
+      <w:r>
+        <w:t xml:space="preserve">d’une personne ou l’extrait fidèle d’un texte,</w:t>
+      </w:r>
+      <w:r>
+        <w:t xml:space="preserve"> </w:t>
+      </w:r>
+      <w:r>
+        <w:rPr>
+          <w:b/>
+          <w:bCs/>
+        </w:rPr>
+        <w:t xml:space="preserve">en les attribuant</w:t>
+      </w:r>
+      <w:r>
+        <w:t xml:space="preserve"> </w:t>
+      </w:r>
+      <w:r>
+        <w:t xml:space="preserve">à leur auteur. C’est un composant de</w:t>
+      </w:r>
+      <w:r>
+        <w:t xml:space="preserve"> </w:t>
+      </w:r>
+      <w:r>
+        <w:rPr>
+          <w:b/>
+          <w:bCs/>
+        </w:rPr>
+        <w:t xml:space="preserve">sens</w:t>
+      </w:r>
+      <w:r>
+        <w:t xml:space="preserve"> </w:t>
+      </w:r>
+      <w:r>
+        <w:t xml:space="preserve">(verbatim attribué), jamais un surligneur décoratif.</w:t>
+      </w:r>
+    </w:p>
+    <w:p>
+      <w:pPr>
+        <w:pStyle w:val="Compact"/>
+        <w:numPr>
+          <w:ilvl w:val="0"/>
+          <w:numId w:val="1073"/>
         </w:numPr>
       </w:pPr>
       <w:r>
@@ -14822,60 +15375,63 @@
         <w:t xml:space="preserve"> </w:t>
       </w:r>
       <w:r>
-        <w:t xml:space="preserve">: rappeler une</w:t>
-      </w:r>
-      <w:r>
-        <w:t xml:space="preserve"> </w:t>
-      </w:r>
-      <w:r>
-        <w:rPr>
-          <w:b/>
-          <w:bCs/>
-        </w:rPr>
-        <w:t xml:space="preserve">consigne clé</w:t>
-      </w:r>
-      <w:r>
-        <w:t xml:space="preserve"> </w:t>
-      </w:r>
-      <w:r>
-        <w:t xml:space="preserve">avant un module de questions (« Répondez en pensant aux 12 derniers mois ») ; donner un</w:t>
-      </w:r>
-      <w:r>
-        <w:t xml:space="preserve"> </w:t>
-      </w:r>
-      <w:r>
-        <w:rPr>
-          <w:b/>
-          <w:bCs/>
-        </w:rPr>
-        <w:t xml:space="preserve">contexte rassurant</w:t>
-      </w:r>
-      <w:r>
-        <w:t xml:space="preserve"> </w:t>
-      </w:r>
-      <w:r>
-        <w:t xml:space="preserve">(durée estimée, anonymat, reprise possible) ; signaler une information</w:t>
-      </w:r>
-      <w:r>
-        <w:t xml:space="preserve"> </w:t>
-      </w:r>
-      <w:r>
-        <w:rPr>
-          <w:b/>
-          <w:bCs/>
-        </w:rPr>
-        <w:t xml:space="preserve">notable mais non urgente</w:t>
-      </w:r>
-      <w:r>
-        <w:t xml:space="preserve">.</w:t>
-      </w:r>
-    </w:p>
-    <w:p>
-      <w:pPr>
-        <w:pStyle w:val="Compact"/>
-        <w:numPr>
-          <w:ilvl w:val="0"/>
-          <w:numId w:val="1071"/>
+        <w:t xml:space="preserve">: un</w:t>
+      </w:r>
+      <w:r>
+        <w:t xml:space="preserve"> </w:t>
+      </w:r>
+      <w:r>
+        <w:rPr>
+          <w:b/>
+          <w:bCs/>
+        </w:rPr>
+        <w:t xml:space="preserve">verbatim de répondant</w:t>
+      </w:r>
+      <w:r>
+        <w:t xml:space="preserve"> </w:t>
+      </w:r>
+      <w:r>
+        <w:t xml:space="preserve">(témoignage, réponse ouverte marquante) attribué à sa source ; une</w:t>
+      </w:r>
+      <w:r>
+        <w:t xml:space="preserve"> </w:t>
+      </w:r>
+      <w:r>
+        <w:rPr>
+          <w:b/>
+          <w:bCs/>
+        </w:rPr>
+        <w:t xml:space="preserve">parole officielle</w:t>
+      </w:r>
+      <w:r>
+        <w:t xml:space="preserve"> </w:t>
+      </w:r>
+      <w:r>
+        <w:t xml:space="preserve">(déclaration d’un responsable) ; un</w:t>
+      </w:r>
+      <w:r>
+        <w:t xml:space="preserve"> </w:t>
+      </w:r>
+      <w:r>
+        <w:rPr>
+          <w:b/>
+          <w:bCs/>
+        </w:rPr>
+        <w:t xml:space="preserve">extrait fidèle</w:t>
+      </w:r>
+      <w:r>
+        <w:t xml:space="preserve"> </w:t>
+      </w:r>
+      <w:r>
+        <w:t xml:space="preserve">d’un texte de référence dont les mots font foi.</w:t>
+      </w:r>
+    </w:p>
+    <w:p>
+      <w:pPr>
+        <w:pStyle w:val="Compact"/>
+        <w:numPr>
+          <w:ilvl w:val="0"/>
+          <w:numId w:val="1073"/>
         </w:numPr>
       </w:pPr>
       <w:r>
@@ -14889,76 +15445,76 @@
         <w:t xml:space="preserve"> </w:t>
       </w:r>
       <w:r>
-        <w:t xml:space="preserve">: une</w:t>
-      </w:r>
-      <w:r>
-        <w:t xml:space="preserve"> </w:t>
-      </w:r>
-      <w:r>
-        <w:rPr>
-          <w:b/>
-          <w:bCs/>
-        </w:rPr>
-        <w:t xml:space="preserve">erreur / succès / info urgente</w:t>
-      </w:r>
-      <w:r>
-        <w:t xml:space="preserve"> </w:t>
-      </w:r>
-      <w:r>
-        <w:t xml:space="preserve">(→ Alerte) ; une</w:t>
-      </w:r>
-      <w:r>
-        <w:t xml:space="preserve"> </w:t>
-      </w:r>
-      <w:r>
-        <w:rPr>
-          <w:b/>
-          <w:bCs/>
-        </w:rPr>
-        <w:t xml:space="preserve">citation</w:t>
-      </w:r>
-      <w:r>
-        <w:t xml:space="preserve"> </w:t>
-      </w:r>
-      <w:r>
-        <w:t xml:space="preserve">(→ Citation) ; une</w:t>
-      </w:r>
-      <w:r>
-        <w:t xml:space="preserve"> </w:t>
-      </w:r>
-      <w:r>
-        <w:rPr>
-          <w:b/>
-          <w:bCs/>
-        </w:rPr>
-        <w:t xml:space="preserve">FAQ</w:t>
-      </w:r>
-      <w:r>
-        <w:t xml:space="preserve"> </w:t>
-      </w:r>
-      <w:r>
-        <w:t xml:space="preserve">repliable (→ Accordéon) ; un simple</w:t>
-      </w:r>
-      <w:r>
-        <w:t xml:space="preserve"> </w:t>
-      </w:r>
-      <w:r>
-        <w:rPr>
-          <w:b/>
-          <w:bCs/>
-        </w:rPr>
-        <w:t xml:space="preserve">encadré coloré « pour faire joli »</w:t>
-      </w:r>
-      <w:r>
-        <w:t xml:space="preserve">.</w:t>
-      </w:r>
-    </w:p>
-    <w:p>
-      <w:pPr>
-        <w:pStyle w:val="Compact"/>
-        <w:numPr>
-          <w:ilvl w:val="0"/>
-          <w:numId w:val="1071"/>
+        <w:t xml:space="preserve">: faire ressortir un</w:t>
+      </w:r>
+      <w:r>
+        <w:t xml:space="preserve"> </w:t>
+      </w:r>
+      <w:r>
+        <w:rPr>
+          <w:b/>
+          <w:bCs/>
+        </w:rPr>
+        <w:t xml:space="preserve">texte ordinaire</w:t>
+      </w:r>
+      <w:r>
+        <w:t xml:space="preserve"> </w:t>
+      </w:r>
+      <w:r>
+        <w:t xml:space="preserve">parce qu’on le trouve « joli » encadré ; porter une</w:t>
+      </w:r>
+      <w:r>
+        <w:t xml:space="preserve"> </w:t>
+      </w:r>
+      <w:r>
+        <w:rPr>
+          <w:b/>
+          <w:bCs/>
+        </w:rPr>
+        <w:t xml:space="preserve">consigne ou une info critique</w:t>
+      </w:r>
+      <w:r>
+        <w:t xml:space="preserve"> </w:t>
+      </w:r>
+      <w:r>
+        <w:t xml:space="preserve">(→ mise en exergue ou alerte) ;</w:t>
+      </w:r>
+      <w:r>
+        <w:t xml:space="preserve"> </w:t>
+      </w:r>
+      <w:r>
+        <w:rPr>
+          <w:b/>
+          <w:bCs/>
+        </w:rPr>
+        <w:t xml:space="preserve">inventer ou reformuler</w:t>
+      </w:r>
+      <w:r>
+        <w:t xml:space="preserve"> </w:t>
+      </w:r>
+      <w:r>
+        <w:t xml:space="preserve">des propos (une citation =</w:t>
+      </w:r>
+      <w:r>
+        <w:t xml:space="preserve"> </w:t>
+      </w:r>
+      <w:r>
+        <w:rPr>
+          <w:b/>
+          <w:bCs/>
+        </w:rPr>
+        <w:t xml:space="preserve">mots exacts + auteur identifiable</w:t>
+      </w:r>
+      <w:r>
+        <w:t xml:space="preserve">).</w:t>
+      </w:r>
+    </w:p>
+    <w:p>
+      <w:pPr>
+        <w:pStyle w:val="Compact"/>
+        <w:numPr>
+          <w:ilvl w:val="0"/>
+          <w:numId w:val="1073"/>
         </w:numPr>
       </w:pPr>
       <w:r>
@@ -14972,62 +15528,81 @@
         <w:t xml:space="preserve"> </w:t>
       </w:r>
       <w:r>
-        <w:t xml:space="preserve">: sa force tient à sa</w:t>
-      </w:r>
-      <w:r>
-        <w:t xml:space="preserve"> </w:t>
-      </w:r>
-      <w:r>
-        <w:rPr>
-          <w:b/>
-          <w:bCs/>
-        </w:rPr>
-        <w:t xml:space="preserve">rareté</w:t>
-      </w:r>
-      <w:r>
-        <w:t xml:space="preserve"> </w:t>
-      </w:r>
-      <w:r>
-        <w:t xml:space="preserve">—</w:t>
-      </w:r>
-      <w:r>
-        <w:t xml:space="preserve"> </w:t>
-      </w:r>
-      <w:r>
-        <w:rPr>
-          <w:b/>
-          <w:bCs/>
-        </w:rPr>
-        <w:t xml:space="preserve">une, exceptionnellement deux</w:t>
-      </w:r>
-      <w:r>
-        <w:t xml:space="preserve"> </w:t>
-      </w:r>
-      <w:r>
-        <w:t xml:space="preserve">par page. Titre court, texte concis (2–3 phrases,</w:t>
-      </w:r>
-      <w:r>
-        <w:t xml:space="preserve"> </w:t>
-      </w:r>
-      <w:r>
-        <w:rPr>
-          <w:b/>
-          <w:bCs/>
-        </w:rPr>
-        <w:t xml:space="preserve">une seule idée</w:t>
-      </w:r>
-      <w:r>
-        <w:t xml:space="preserve">).</w:t>
+        <w:t xml:space="preserve">: reproduisez les propos</w:t>
+      </w:r>
+      <w:r>
+        <w:t xml:space="preserve"> </w:t>
+      </w:r>
+      <w:r>
+        <w:rPr>
+          <w:b/>
+          <w:bCs/>
+        </w:rPr>
+        <w:t xml:space="preserve">mot pour mot</w:t>
+      </w:r>
+      <w:r>
+        <w:t xml:space="preserve"> </w:t>
+      </w:r>
+      <w:r>
+        <w:t xml:space="preserve">et</w:t>
+      </w:r>
+      <w:r>
+        <w:t xml:space="preserve"> </w:t>
+      </w:r>
+      <w:r>
+        <w:rPr>
+          <w:b/>
+          <w:bCs/>
+        </w:rPr>
+        <w:t xml:space="preserve">attribuez-les systématiquement</w:t>
+      </w:r>
+      <w:r>
+        <w:t xml:space="preserve"> </w:t>
+      </w:r>
+      <w:r>
+        <w:t xml:space="preserve">(nom, et si utile fonction/organisme) — une citation</w:t>
+      </w:r>
+      <w:r>
+        <w:t xml:space="preserve"> </w:t>
+      </w:r>
+      <w:r>
+        <w:rPr>
+          <w:b/>
+          <w:bCs/>
+        </w:rPr>
+        <w:t xml:space="preserve">sans auteur</w:t>
+      </w:r>
+      <w:r>
+        <w:t xml:space="preserve"> </w:t>
+      </w:r>
+      <w:r>
+        <w:t xml:space="preserve">perd son sens. Une ou deux par page suffisent. Sur des réponses au questionnaire,</w:t>
+      </w:r>
+      <w:r>
+        <w:t xml:space="preserve"> </w:t>
+      </w:r>
+      <w:r>
+        <w:rPr>
+          <w:b/>
+          <w:bCs/>
+        </w:rPr>
+        <w:t xml:space="preserve">anonymisez ou obtenez le consentement</w:t>
+      </w:r>
+      <w:r>
+        <w:t xml:space="preserve"> </w:t>
+      </w:r>
+      <w:r>
+        <w:t xml:space="preserve">avant d’attribuer nominativement.</w:t>
       </w:r>
     </w:p>
     <w:bookmarkEnd w:id="148"/>
-    <w:bookmarkStart w:id="149" w:name="X2f01da74a2c1ebc75f2da39eab28ef0f8ff8fc8"/>
+    <w:bookmarkStart w:id="149" w:name="Xfd2ca9838f6c347c8076a7a664a2e9be52f7b4e"/>
     <w:p>
       <w:pPr>
         <w:pStyle w:val="Heading4"/>
       </w:pPr>
       <w:r>
-        <w:t xml:space="preserve">Mise en exergue — faire ressortir un court passage clé</w:t>
+        <w:t xml:space="preserve">Tableau — des données comparables en lignes et colonnes</w:t>
       </w:r>
     </w:p>
     <w:p>
@@ -15035,44 +15610,60 @@
         <w:pStyle w:val="FirstParagraph"/>
       </w:pPr>
       <w:r>
-        <w:t xml:space="preserve">La mise en exergue détache un</w:t>
-      </w:r>
-      <w:r>
-        <w:t xml:space="preserve"> </w:t>
-      </w:r>
-      <w:r>
-        <w:rPr>
-          <w:b/>
-          <w:bCs/>
-        </w:rPr>
-        <w:t xml:space="preserve">court passage de texte réellement important</w:t>
-      </w:r>
-      <w:r>
-        <w:t xml:space="preserve"> </w:t>
-      </w:r>
-      <w:r>
-        <w:t xml:space="preserve">par un</w:t>
-      </w:r>
-      <w:r>
-        <w:t xml:space="preserve"> </w:t>
-      </w:r>
-      <w:r>
-        <w:rPr>
-          <w:b/>
-          <w:bCs/>
-        </w:rPr>
-        <w:t xml:space="preserve">liseré vertical coloré</w:t>
-      </w:r>
-      <w:r>
-        <w:t xml:space="preserve">, sans changer son sens ni sonner l’alerte.</w:t>
-      </w:r>
-    </w:p>
-    <w:p>
-      <w:pPr>
-        <w:pStyle w:val="Compact"/>
-        <w:numPr>
-          <w:ilvl w:val="0"/>
-          <w:numId w:val="1072"/>
+        <w:t xml:space="preserve">Le tableau présente des</w:t>
+      </w:r>
+      <w:r>
+        <w:t xml:space="preserve"> </w:t>
+      </w:r>
+      <w:r>
+        <w:rPr>
+          <w:b/>
+          <w:bCs/>
+        </w:rPr>
+        <w:t xml:space="preserve">données structurées et comparables</w:t>
+      </w:r>
+      <w:r>
+        <w:t xml:space="preserve">, pour que le lecteur puisse</w:t>
+      </w:r>
+      <w:r>
+        <w:t xml:space="preserve"> </w:t>
+      </w:r>
+      <w:r>
+        <w:rPr>
+          <w:b/>
+          <w:bCs/>
+        </w:rPr>
+        <w:t xml:space="preserve">lire, croiser et comparer</w:t>
+      </w:r>
+      <w:r>
+        <w:t xml:space="preserve"> </w:t>
+      </w:r>
+      <w:r>
+        <w:t xml:space="preserve">des valeurs. Ce n’est</w:t>
+      </w:r>
+      <w:r>
+        <w:t xml:space="preserve"> </w:t>
+      </w:r>
+      <w:r>
+        <w:rPr>
+          <w:b/>
+          <w:bCs/>
+        </w:rPr>
+        <w:t xml:space="preserve">jamais</w:t>
+      </w:r>
+      <w:r>
+        <w:t xml:space="preserve"> </w:t>
+      </w:r>
+      <w:r>
+        <w:t xml:space="preserve">un outil de mise en page.</w:t>
+      </w:r>
+    </w:p>
+    <w:p>
+      <w:pPr>
+        <w:pStyle w:val="Compact"/>
+        <w:numPr>
+          <w:ilvl w:val="0"/>
+          <w:numId w:val="1074"/>
         </w:numPr>
       </w:pPr>
       <w:r>
@@ -15086,31 +15677,47 @@
         <w:t xml:space="preserve"> </w:t>
       </w:r>
       <w:r>
-        <w:t xml:space="preserve">: souligner une</w:t>
-      </w:r>
-      <w:r>
-        <w:t xml:space="preserve"> </w:t>
-      </w:r>
-      <w:r>
-        <w:rPr>
-          <w:b/>
-          <w:bCs/>
-        </w:rPr>
-        <w:t xml:space="preserve">information clé</w:t>
-      </w:r>
-      <w:r>
-        <w:t xml:space="preserve"> </w:t>
-      </w:r>
-      <w:r>
-        <w:t xml:space="preserve">dans une introduction ou une consigne (« Vos réponses restent anonymes ») ; une phrase-pivot à lire avant de commencer ; aérer un texte dense en isolant l’idée directrice.</w:t>
-      </w:r>
-    </w:p>
-    <w:p>
-      <w:pPr>
-        <w:pStyle w:val="Compact"/>
-        <w:numPr>
-          <w:ilvl w:val="0"/>
-          <w:numId w:val="1072"/>
+        <w:t xml:space="preserve">: des données</w:t>
+      </w:r>
+      <w:r>
+        <w:t xml:space="preserve"> </w:t>
+      </w:r>
+      <w:r>
+        <w:rPr>
+          <w:b/>
+          <w:bCs/>
+        </w:rPr>
+        <w:t xml:space="preserve">réellement tabulaires</w:t>
+      </w:r>
+      <w:r>
+        <w:t xml:space="preserve"> </w:t>
+      </w:r>
+      <w:r>
+        <w:t xml:space="preserve">(une même information déclinée sur plusieurs entrées : liste de documents avec format et date, résultats par question) ; permettre de</w:t>
+      </w:r>
+      <w:r>
+        <w:t xml:space="preserve"> </w:t>
+      </w:r>
+      <w:r>
+        <w:rPr>
+          <w:b/>
+          <w:bCs/>
+        </w:rPr>
+        <w:t xml:space="preserve">comparer</w:t>
+      </w:r>
+      <w:r>
+        <w:t xml:space="preserve"> </w:t>
+      </w:r>
+      <w:r>
+        <w:t xml:space="preserve">ligne à ligne ou colonne à colonne.</w:t>
+      </w:r>
+    </w:p>
+    <w:p>
+      <w:pPr>
+        <w:pStyle w:val="Compact"/>
+        <w:numPr>
+          <w:ilvl w:val="0"/>
+          <w:numId w:val="1074"/>
         </w:numPr>
       </w:pPr>
       <w:r>
@@ -15124,95 +15731,79 @@
         <w:t xml:space="preserve"> </w:t>
       </w:r>
       <w:r>
-        <w:t xml:space="preserve">: une</w:t>
-      </w:r>
-      <w:r>
-        <w:t xml:space="preserve"> </w:t>
-      </w:r>
-      <w:r>
-        <w:rPr>
-          <w:b/>
-          <w:bCs/>
-        </w:rPr>
-        <w:t xml:space="preserve">erreur / info critique temporaire</w:t>
-      </w:r>
-      <w:r>
-        <w:t xml:space="preserve"> </w:t>
-      </w:r>
-      <w:r>
-        <w:t xml:space="preserve">(→ Alerte) ; une</w:t>
-      </w:r>
-      <w:r>
-        <w:t xml:space="preserve"> </w:t>
-      </w:r>
-      <w:r>
-        <w:rPr>
-          <w:b/>
-          <w:bCs/>
-        </w:rPr>
-        <w:t xml:space="preserve">parole attribuée</w:t>
-      </w:r>
-      <w:r>
-        <w:t xml:space="preserve"> </w:t>
-      </w:r>
-      <w:r>
-        <w:t xml:space="preserve">(→ Citation) ;</w:t>
-      </w:r>
-      <w:r>
-        <w:t xml:space="preserve"> </w:t>
-      </w:r>
-      <w:r>
-        <w:rPr>
-          <w:b/>
-          <w:bCs/>
-        </w:rPr>
-        <w:t xml:space="preserve">décorer</w:t>
-      </w:r>
-      <w:r>
-        <w:t xml:space="preserve"> </w:t>
-      </w:r>
-      <w:r>
-        <w:t xml:space="preserve">la page ; encadrer de</w:t>
-      </w:r>
-      <w:r>
-        <w:t xml:space="preserve"> </w:t>
-      </w:r>
-      <w:r>
-        <w:rPr>
-          <w:b/>
-          <w:bCs/>
-        </w:rPr>
-        <w:t xml:space="preserve">longs blocs</w:t>
-      </w:r>
-      <w:r>
-        <w:t xml:space="preserve"> </w:t>
-      </w:r>
-      <w:r>
-        <w:t xml:space="preserve">ou</w:t>
-      </w:r>
-      <w:r>
-        <w:t xml:space="preserve"> </w:t>
-      </w:r>
-      <w:r>
-        <w:rPr>
-          <w:b/>
-          <w:bCs/>
-        </w:rPr>
-        <w:t xml:space="preserve">empiler</w:t>
-      </w:r>
-      <w:r>
-        <w:t xml:space="preserve"> </w:t>
-      </w:r>
-      <w:r>
-        <w:t xml:space="preserve">les exergues.</w:t>
-      </w:r>
-    </w:p>
-    <w:p>
-      <w:pPr>
-        <w:pStyle w:val="Compact"/>
-        <w:numPr>
-          <w:ilvl w:val="0"/>
-          <w:numId w:val="1072"/>
+        <w:t xml:space="preserve">:</w:t>
+      </w:r>
+      <w:r>
+        <w:t xml:space="preserve"> </w:t>
+      </w:r>
+      <w:r>
+        <w:rPr>
+          <w:b/>
+          <w:bCs/>
+        </w:rPr>
+        <w:t xml:space="preserve">mettre en page</w:t>
+      </w:r>
+      <w:r>
+        <w:t xml:space="preserve"> </w:t>
+      </w:r>
+      <w:r>
+        <w:t xml:space="preserve">des blocs visuels ; afficher une</w:t>
+      </w:r>
+      <w:r>
+        <w:t xml:space="preserve"> </w:t>
+      </w:r>
+      <w:r>
+        <w:rPr>
+          <w:b/>
+          <w:bCs/>
+        </w:rPr>
+        <w:t xml:space="preserve">paire clé/valeur isolée</w:t>
+      </w:r>
+      <w:r>
+        <w:t xml:space="preserve"> </w:t>
+      </w:r>
+      <w:r>
+        <w:t xml:space="preserve">(→ badge ou simple phrase) ; un contenu</w:t>
+      </w:r>
+      <w:r>
+        <w:t xml:space="preserve"> </w:t>
+      </w:r>
+      <w:r>
+        <w:rPr>
+          <w:b/>
+          <w:bCs/>
+        </w:rPr>
+        <w:t xml:space="preserve">narratif ou hiérarchique</w:t>
+      </w:r>
+      <w:r>
+        <w:t xml:space="preserve"> </w:t>
+      </w:r>
+      <w:r>
+        <w:t xml:space="preserve">(→ accordéon / liste) ; reproduire une</w:t>
+      </w:r>
+      <w:r>
+        <w:t xml:space="preserve"> </w:t>
+      </w:r>
+      <w:r>
+        <w:rPr>
+          <w:b/>
+          <w:bCs/>
+        </w:rPr>
+        <w:t xml:space="preserve">tendance</w:t>
+      </w:r>
+      <w:r>
+        <w:t xml:space="preserve"> </w:t>
+      </w:r>
+      <w:r>
+        <w:t xml:space="preserve">(→ un graphique serait plus lisible).</w:t>
+      </w:r>
+    </w:p>
+    <w:p>
+      <w:pPr>
+        <w:pStyle w:val="Compact"/>
+        <w:numPr>
+          <w:ilvl w:val="0"/>
+          <w:numId w:val="1074"/>
         </w:numPr>
       </w:pPr>
       <w:r>
@@ -15226,695 +15817,104 @@
         <w:t xml:space="preserve"> </w:t>
       </w:r>
       <w:r>
-        <w:t xml:space="preserve">: une à trois phrases, rédigées comme un</w:t>
-      </w:r>
-      <w:r>
-        <w:t xml:space="preserve"> </w:t>
-      </w:r>
-      <w:r>
-        <w:rPr>
-          <w:b/>
-          <w:bCs/>
-        </w:rPr>
-        <w:t xml:space="preserve">message autoportant</w:t>
-      </w:r>
-      <w:r>
-        <w:t xml:space="preserve"> </w:t>
-      </w:r>
-      <w:r>
-        <w:t xml:space="preserve">;</w:t>
-      </w:r>
-      <w:r>
-        <w:t xml:space="preserve"> </w:t>
-      </w:r>
-      <w:r>
-        <w:rPr>
-          <w:b/>
-          <w:bCs/>
-        </w:rPr>
-        <w:t xml:space="preserve">une seule</w:t>
-      </w:r>
-      <w:r>
-        <w:t xml:space="preserve"> </w:t>
-      </w:r>
-      <w:r>
-        <w:t xml:space="preserve">(au maximum deux) par écran. Évitez le gras et les majuscules à l’intérieur — le liseré suffit déjà à hiérarchiser. Dans le doute : « est-ce un état / une action à corriger ? » →</w:t>
-      </w:r>
-      <w:r>
-        <w:t xml:space="preserve"> </w:t>
-      </w:r>
-      <w:r>
-        <w:rPr>
-          <w:b/>
-          <w:bCs/>
-        </w:rPr>
-        <w:t xml:space="preserve">Alerte</w:t>
-      </w:r>
-      <w:r>
-        <w:t xml:space="preserve"> </w:t>
-      </w:r>
-      <w:r>
-        <w:t xml:space="preserve">; « est-ce une information de fond à retenir ? » →</w:t>
-      </w:r>
-      <w:r>
-        <w:t xml:space="preserve"> </w:t>
-      </w:r>
-      <w:r>
-        <w:rPr>
-          <w:b/>
-          <w:bCs/>
-        </w:rPr>
-        <w:t xml:space="preserve">Mise en exergue</w:t>
-      </w:r>
-      <w:r>
-        <w:t xml:space="preserve">.</w:t>
+        <w:t xml:space="preserve">: toujours renseigner un</w:t>
+      </w:r>
+      <w:r>
+        <w:t xml:space="preserve"> </w:t>
+      </w:r>
+      <w:r>
+        <w:rPr>
+          <w:b/>
+          <w:bCs/>
+        </w:rPr>
+        <w:t xml:space="preserve">titre</w:t>
+      </w:r>
+      <w:r>
+        <w:t xml:space="preserve"> </w:t>
+      </w:r>
+      <w:r>
+        <w:t xml:space="preserve">(la légende qui annonce le contenu — le modèle contient « Titre du tableau », à remplacer) ; des</w:t>
+      </w:r>
+      <w:r>
+        <w:t xml:space="preserve"> </w:t>
+      </w:r>
+      <w:r>
+        <w:rPr>
+          <w:b/>
+          <w:bCs/>
+        </w:rPr>
+        <w:t xml:space="preserve">en-têtes de colonnes</w:t>
+      </w:r>
+      <w:r>
+        <w:t xml:space="preserve"> </w:t>
+      </w:r>
+      <w:r>
+        <w:t xml:space="preserve">courts et explicites (le modèle les fournit, à conserver) ;</w:t>
+      </w:r>
+      <w:r>
+        <w:t xml:space="preserve"> </w:t>
+      </w:r>
+      <w:r>
+        <w:rPr>
+          <w:b/>
+          <w:bCs/>
+        </w:rPr>
+        <w:t xml:space="preserve">évitez les cellules fusionnées</w:t>
+      </w:r>
+      <w:r>
+        <w:t xml:space="preserve"> </w:t>
+      </w:r>
+      <w:r>
+        <w:t xml:space="preserve">et les tableaux imbriqués qui gênent la lecture par lecteur d’écran. Sur mobile,</w:t>
+      </w:r>
+      <w:r>
+        <w:t xml:space="preserve"> </w:t>
+      </w:r>
+      <w:r>
+        <w:rPr>
+          <w:b/>
+          <w:bCs/>
+        </w:rPr>
+        <w:t xml:space="preserve">limitez le nombre de colonnes à l’essentiel</w:t>
+      </w:r>
+      <w:r>
+        <w:t xml:space="preserve"> </w:t>
+      </w:r>
+      <w:r>
+        <w:t xml:space="preserve">et laissez le défilement horizontal faire son travail. Règle d’or : si vous ne pouvez pas</w:t>
+      </w:r>
+      <w:r>
+        <w:t xml:space="preserve"> </w:t>
+      </w:r>
+      <w:r>
+        <w:rPr>
+          <w:b/>
+          <w:bCs/>
+        </w:rPr>
+        <w:t xml:space="preserve">nommer chaque colonne</w:t>
+      </w:r>
+      <w:r>
+        <w:t xml:space="preserve"> </w:t>
+      </w:r>
+      <w:r>
+        <w:t xml:space="preserve">ni justifier que les lignes se</w:t>
+      </w:r>
+      <w:r>
+        <w:t xml:space="preserve"> </w:t>
+      </w:r>
+      <w:r>
+        <w:rPr>
+          <w:b/>
+          <w:bCs/>
+        </w:rPr>
+        <w:t xml:space="preserve">comparent</w:t>
+      </w:r>
+      <w:r>
+        <w:t xml:space="preserve">, ce n’est pas un tableau.</w:t>
       </w:r>
     </w:p>
     <w:bookmarkEnd w:id="149"/>
-    <w:bookmarkStart w:id="150" w:name="X303b59db22d0d1de2e94c96047ce3a1bf88aebd"/>
-    <w:p>
-      <w:pPr>
-        <w:pStyle w:val="Heading4"/>
-      </w:pPr>
-      <w:r>
-        <w:t xml:space="preserve">Citation — une parole rapportée, attribuée à son auteur</w:t>
-      </w:r>
-    </w:p>
-    <w:p>
-      <w:pPr>
-        <w:pStyle w:val="FirstParagraph"/>
-      </w:pPr>
-      <w:r>
-        <w:t xml:space="preserve">La citation met en valeur les</w:t>
-      </w:r>
-      <w:r>
-        <w:t xml:space="preserve"> </w:t>
-      </w:r>
-      <w:r>
-        <w:rPr>
-          <w:b/>
-          <w:bCs/>
-        </w:rPr>
-        <w:t xml:space="preserve">propos exacts</w:t>
-      </w:r>
-      <w:r>
-        <w:t xml:space="preserve"> </w:t>
-      </w:r>
-      <w:r>
-        <w:t xml:space="preserve">d’une personne ou l’extrait fidèle d’un texte,</w:t>
-      </w:r>
-      <w:r>
-        <w:t xml:space="preserve"> </w:t>
-      </w:r>
-      <w:r>
-        <w:rPr>
-          <w:b/>
-          <w:bCs/>
-        </w:rPr>
-        <w:t xml:space="preserve">en les attribuant</w:t>
-      </w:r>
-      <w:r>
-        <w:t xml:space="preserve"> </w:t>
-      </w:r>
-      <w:r>
-        <w:t xml:space="preserve">à leur auteur. C’est un composant de</w:t>
-      </w:r>
-      <w:r>
-        <w:t xml:space="preserve"> </w:t>
-      </w:r>
-      <w:r>
-        <w:rPr>
-          <w:b/>
-          <w:bCs/>
-        </w:rPr>
-        <w:t xml:space="preserve">sens</w:t>
-      </w:r>
-      <w:r>
-        <w:t xml:space="preserve"> </w:t>
-      </w:r>
-      <w:r>
-        <w:t xml:space="preserve">(verbatim attribué), jamais un surligneur décoratif.</w:t>
-      </w:r>
-    </w:p>
-    <w:p>
-      <w:pPr>
-        <w:pStyle w:val="Compact"/>
-        <w:numPr>
-          <w:ilvl w:val="0"/>
-          <w:numId w:val="1073"/>
-        </w:numPr>
-      </w:pPr>
-      <w:r>
-        <w:rPr>
-          <w:b/>
-          <w:bCs/>
-        </w:rPr>
-        <w:t xml:space="preserve">À utiliser pour</w:t>
-      </w:r>
-      <w:r>
-        <w:t xml:space="preserve"> </w:t>
-      </w:r>
-      <w:r>
-        <w:t xml:space="preserve">: un</w:t>
-      </w:r>
-      <w:r>
-        <w:t xml:space="preserve"> </w:t>
-      </w:r>
-      <w:r>
-        <w:rPr>
-          <w:b/>
-          <w:bCs/>
-        </w:rPr>
-        <w:t xml:space="preserve">verbatim de répondant</w:t>
-      </w:r>
-      <w:r>
-        <w:t xml:space="preserve"> </w:t>
-      </w:r>
-      <w:r>
-        <w:t xml:space="preserve">(témoignage, réponse ouverte marquante) attribué à sa source ; une</w:t>
-      </w:r>
-      <w:r>
-        <w:t xml:space="preserve"> </w:t>
-      </w:r>
-      <w:r>
-        <w:rPr>
-          <w:b/>
-          <w:bCs/>
-        </w:rPr>
-        <w:t xml:space="preserve">parole officielle</w:t>
-      </w:r>
-      <w:r>
-        <w:t xml:space="preserve"> </w:t>
-      </w:r>
-      <w:r>
-        <w:t xml:space="preserve">(déclaration d’un responsable) ; un</w:t>
-      </w:r>
-      <w:r>
-        <w:t xml:space="preserve"> </w:t>
-      </w:r>
-      <w:r>
-        <w:rPr>
-          <w:b/>
-          <w:bCs/>
-        </w:rPr>
-        <w:t xml:space="preserve">extrait fidèle</w:t>
-      </w:r>
-      <w:r>
-        <w:t xml:space="preserve"> </w:t>
-      </w:r>
-      <w:r>
-        <w:t xml:space="preserve">d’un texte de référence dont les mots font foi.</w:t>
-      </w:r>
-    </w:p>
-    <w:p>
-      <w:pPr>
-        <w:pStyle w:val="Compact"/>
-        <w:numPr>
-          <w:ilvl w:val="0"/>
-          <w:numId w:val="1073"/>
-        </w:numPr>
-      </w:pPr>
-      <w:r>
-        <w:rPr>
-          <w:b/>
-          <w:bCs/>
-        </w:rPr>
-        <w:t xml:space="preserve">À NE PAS utiliser pour</w:t>
-      </w:r>
-      <w:r>
-        <w:t xml:space="preserve"> </w:t>
-      </w:r>
-      <w:r>
-        <w:t xml:space="preserve">: faire ressortir un</w:t>
-      </w:r>
-      <w:r>
-        <w:t xml:space="preserve"> </w:t>
-      </w:r>
-      <w:r>
-        <w:rPr>
-          <w:b/>
-          <w:bCs/>
-        </w:rPr>
-        <w:t xml:space="preserve">texte ordinaire</w:t>
-      </w:r>
-      <w:r>
-        <w:t xml:space="preserve"> </w:t>
-      </w:r>
-      <w:r>
-        <w:t xml:space="preserve">parce qu’on le trouve « joli » encadré ; porter une</w:t>
-      </w:r>
-      <w:r>
-        <w:t xml:space="preserve"> </w:t>
-      </w:r>
-      <w:r>
-        <w:rPr>
-          <w:b/>
-          <w:bCs/>
-        </w:rPr>
-        <w:t xml:space="preserve">consigne ou une info critique</w:t>
-      </w:r>
-      <w:r>
-        <w:t xml:space="preserve"> </w:t>
-      </w:r>
-      <w:r>
-        <w:t xml:space="preserve">(→ mise en exergue ou alerte) ;</w:t>
-      </w:r>
-      <w:r>
-        <w:t xml:space="preserve"> </w:t>
-      </w:r>
-      <w:r>
-        <w:rPr>
-          <w:b/>
-          <w:bCs/>
-        </w:rPr>
-        <w:t xml:space="preserve">inventer ou reformuler</w:t>
-      </w:r>
-      <w:r>
-        <w:t xml:space="preserve"> </w:t>
-      </w:r>
-      <w:r>
-        <w:t xml:space="preserve">des propos (une citation =</w:t>
-      </w:r>
-      <w:r>
-        <w:t xml:space="preserve"> </w:t>
-      </w:r>
-      <w:r>
-        <w:rPr>
-          <w:b/>
-          <w:bCs/>
-        </w:rPr>
-        <w:t xml:space="preserve">mots exacts + auteur identifiable</w:t>
-      </w:r>
-      <w:r>
-        <w:t xml:space="preserve">).</w:t>
-      </w:r>
-    </w:p>
-    <w:p>
-      <w:pPr>
-        <w:pStyle w:val="Compact"/>
-        <w:numPr>
-          <w:ilvl w:val="0"/>
-          <w:numId w:val="1073"/>
-        </w:numPr>
-      </w:pPr>
-      <w:r>
-        <w:rPr>
-          <w:b/>
-          <w:bCs/>
-        </w:rPr>
-        <w:t xml:space="preserve">Bonnes pratiques</w:t>
-      </w:r>
-      <w:r>
-        <w:t xml:space="preserve"> </w:t>
-      </w:r>
-      <w:r>
-        <w:t xml:space="preserve">: reproduisez les propos</w:t>
-      </w:r>
-      <w:r>
-        <w:t xml:space="preserve"> </w:t>
-      </w:r>
-      <w:r>
-        <w:rPr>
-          <w:b/>
-          <w:bCs/>
-        </w:rPr>
-        <w:t xml:space="preserve">mot pour mot</w:t>
-      </w:r>
-      <w:r>
-        <w:t xml:space="preserve"> </w:t>
-      </w:r>
-      <w:r>
-        <w:t xml:space="preserve">et</w:t>
-      </w:r>
-      <w:r>
-        <w:t xml:space="preserve"> </w:t>
-      </w:r>
-      <w:r>
-        <w:rPr>
-          <w:b/>
-          <w:bCs/>
-        </w:rPr>
-        <w:t xml:space="preserve">attribuez-les systématiquement</w:t>
-      </w:r>
-      <w:r>
-        <w:t xml:space="preserve"> </w:t>
-      </w:r>
-      <w:r>
-        <w:t xml:space="preserve">(nom, et si utile fonction/organisme) — une citation</w:t>
-      </w:r>
-      <w:r>
-        <w:t xml:space="preserve"> </w:t>
-      </w:r>
-      <w:r>
-        <w:rPr>
-          <w:b/>
-          <w:bCs/>
-        </w:rPr>
-        <w:t xml:space="preserve">sans auteur</w:t>
-      </w:r>
-      <w:r>
-        <w:t xml:space="preserve"> </w:t>
-      </w:r>
-      <w:r>
-        <w:t xml:space="preserve">perd son sens. Une ou deux par page suffisent. Sur des réponses au questionnaire,</w:t>
-      </w:r>
-      <w:r>
-        <w:t xml:space="preserve"> </w:t>
-      </w:r>
-      <w:r>
-        <w:rPr>
-          <w:b/>
-          <w:bCs/>
-        </w:rPr>
-        <w:t xml:space="preserve">anonymisez ou obtenez le consentement</w:t>
-      </w:r>
-      <w:r>
-        <w:t xml:space="preserve"> </w:t>
-      </w:r>
-      <w:r>
-        <w:t xml:space="preserve">avant d’attribuer nominativement.</w:t>
-      </w:r>
-    </w:p>
-    <w:bookmarkEnd w:id="150"/>
-    <w:bookmarkStart w:id="151" w:name="Xfd2ca9838f6c347c8076a7a664a2e9be52f7b4e"/>
-    <w:p>
-      <w:pPr>
-        <w:pStyle w:val="Heading4"/>
-      </w:pPr>
-      <w:r>
-        <w:t xml:space="preserve">Tableau — des données comparables en lignes et colonnes</w:t>
-      </w:r>
-    </w:p>
-    <w:p>
-      <w:pPr>
-        <w:pStyle w:val="FirstParagraph"/>
-      </w:pPr>
-      <w:r>
-        <w:t xml:space="preserve">Le tableau présente des</w:t>
-      </w:r>
-      <w:r>
-        <w:t xml:space="preserve"> </w:t>
-      </w:r>
-      <w:r>
-        <w:rPr>
-          <w:b/>
-          <w:bCs/>
-        </w:rPr>
-        <w:t xml:space="preserve">données structurées et comparables</w:t>
-      </w:r>
-      <w:r>
-        <w:t xml:space="preserve">, pour que le lecteur puisse</w:t>
-      </w:r>
-      <w:r>
-        <w:t xml:space="preserve"> </w:t>
-      </w:r>
-      <w:r>
-        <w:rPr>
-          <w:b/>
-          <w:bCs/>
-        </w:rPr>
-        <w:t xml:space="preserve">lire, croiser et comparer</w:t>
-      </w:r>
-      <w:r>
-        <w:t xml:space="preserve"> </w:t>
-      </w:r>
-      <w:r>
-        <w:t xml:space="preserve">des valeurs. Ce n’est</w:t>
-      </w:r>
-      <w:r>
-        <w:t xml:space="preserve"> </w:t>
-      </w:r>
-      <w:r>
-        <w:rPr>
-          <w:b/>
-          <w:bCs/>
-        </w:rPr>
-        <w:t xml:space="preserve">jamais</w:t>
-      </w:r>
-      <w:r>
-        <w:t xml:space="preserve"> </w:t>
-      </w:r>
-      <w:r>
-        <w:t xml:space="preserve">un outil de mise en page.</w:t>
-      </w:r>
-    </w:p>
-    <w:p>
-      <w:pPr>
-        <w:pStyle w:val="Compact"/>
-        <w:numPr>
-          <w:ilvl w:val="0"/>
-          <w:numId w:val="1074"/>
-        </w:numPr>
-      </w:pPr>
-      <w:r>
-        <w:rPr>
-          <w:b/>
-          <w:bCs/>
-        </w:rPr>
-        <w:t xml:space="preserve">À utiliser pour</w:t>
-      </w:r>
-      <w:r>
-        <w:t xml:space="preserve"> </w:t>
-      </w:r>
-      <w:r>
-        <w:t xml:space="preserve">: des données</w:t>
-      </w:r>
-      <w:r>
-        <w:t xml:space="preserve"> </w:t>
-      </w:r>
-      <w:r>
-        <w:rPr>
-          <w:b/>
-          <w:bCs/>
-        </w:rPr>
-        <w:t xml:space="preserve">réellement tabulaires</w:t>
-      </w:r>
-      <w:r>
-        <w:t xml:space="preserve"> </w:t>
-      </w:r>
-      <w:r>
-        <w:t xml:space="preserve">(une même information déclinée sur plusieurs entrées : liste de documents avec format et date, résultats par question) ; permettre de</w:t>
-      </w:r>
-      <w:r>
-        <w:t xml:space="preserve"> </w:t>
-      </w:r>
-      <w:r>
-        <w:rPr>
-          <w:b/>
-          <w:bCs/>
-        </w:rPr>
-        <w:t xml:space="preserve">comparer</w:t>
-      </w:r>
-      <w:r>
-        <w:t xml:space="preserve"> </w:t>
-      </w:r>
-      <w:r>
-        <w:t xml:space="preserve">ligne à ligne ou colonne à colonne.</w:t>
-      </w:r>
-    </w:p>
-    <w:p>
-      <w:pPr>
-        <w:pStyle w:val="Compact"/>
-        <w:numPr>
-          <w:ilvl w:val="0"/>
-          <w:numId w:val="1074"/>
-        </w:numPr>
-      </w:pPr>
-      <w:r>
-        <w:rPr>
-          <w:b/>
-          <w:bCs/>
-        </w:rPr>
-        <w:t xml:space="preserve">À NE PAS utiliser pour</w:t>
-      </w:r>
-      <w:r>
-        <w:t xml:space="preserve"> </w:t>
-      </w:r>
-      <w:r>
-        <w:t xml:space="preserve">:</w:t>
-      </w:r>
-      <w:r>
-        <w:t xml:space="preserve"> </w:t>
-      </w:r>
-      <w:r>
-        <w:rPr>
-          <w:b/>
-          <w:bCs/>
-        </w:rPr>
-        <w:t xml:space="preserve">mettre en page</w:t>
-      </w:r>
-      <w:r>
-        <w:t xml:space="preserve"> </w:t>
-      </w:r>
-      <w:r>
-        <w:t xml:space="preserve">des blocs visuels ; afficher une</w:t>
-      </w:r>
-      <w:r>
-        <w:t xml:space="preserve"> </w:t>
-      </w:r>
-      <w:r>
-        <w:rPr>
-          <w:b/>
-          <w:bCs/>
-        </w:rPr>
-        <w:t xml:space="preserve">paire clé/valeur isolée</w:t>
-      </w:r>
-      <w:r>
-        <w:t xml:space="preserve"> </w:t>
-      </w:r>
-      <w:r>
-        <w:t xml:space="preserve">(→ badge ou simple phrase) ; un contenu</w:t>
-      </w:r>
-      <w:r>
-        <w:t xml:space="preserve"> </w:t>
-      </w:r>
-      <w:r>
-        <w:rPr>
-          <w:b/>
-          <w:bCs/>
-        </w:rPr>
-        <w:t xml:space="preserve">narratif ou hiérarchique</w:t>
-      </w:r>
-      <w:r>
-        <w:t xml:space="preserve"> </w:t>
-      </w:r>
-      <w:r>
-        <w:t xml:space="preserve">(→ accordéon / liste) ; reproduire une</w:t>
-      </w:r>
-      <w:r>
-        <w:t xml:space="preserve"> </w:t>
-      </w:r>
-      <w:r>
-        <w:rPr>
-          <w:b/>
-          <w:bCs/>
-        </w:rPr>
-        <w:t xml:space="preserve">tendance</w:t>
-      </w:r>
-      <w:r>
-        <w:t xml:space="preserve"> </w:t>
-      </w:r>
-      <w:r>
-        <w:t xml:space="preserve">(→ un graphique serait plus lisible).</w:t>
-      </w:r>
-    </w:p>
-    <w:p>
-      <w:pPr>
-        <w:pStyle w:val="Compact"/>
-        <w:numPr>
-          <w:ilvl w:val="0"/>
-          <w:numId w:val="1074"/>
-        </w:numPr>
-      </w:pPr>
-      <w:r>
-        <w:rPr>
-          <w:b/>
-          <w:bCs/>
-        </w:rPr>
-        <w:t xml:space="preserve">Bonnes pratiques</w:t>
-      </w:r>
-      <w:r>
-        <w:t xml:space="preserve"> </w:t>
-      </w:r>
-      <w:r>
-        <w:t xml:space="preserve">: toujours renseigner un</w:t>
-      </w:r>
-      <w:r>
-        <w:t xml:space="preserve"> </w:t>
-      </w:r>
-      <w:r>
-        <w:rPr>
-          <w:b/>
-          <w:bCs/>
-        </w:rPr>
-        <w:t xml:space="preserve">titre</w:t>
-      </w:r>
-      <w:r>
-        <w:t xml:space="preserve"> </w:t>
-      </w:r>
-      <w:r>
-        <w:t xml:space="preserve">(la légende qui annonce le contenu — le modèle contient « Titre du tableau », à remplacer) ; des</w:t>
-      </w:r>
-      <w:r>
-        <w:t xml:space="preserve"> </w:t>
-      </w:r>
-      <w:r>
-        <w:rPr>
-          <w:b/>
-          <w:bCs/>
-        </w:rPr>
-        <w:t xml:space="preserve">en-têtes de colonnes</w:t>
-      </w:r>
-      <w:r>
-        <w:t xml:space="preserve"> </w:t>
-      </w:r>
-      <w:r>
-        <w:t xml:space="preserve">courts et explicites (le modèle les fournit, à conserver) ;</w:t>
-      </w:r>
-      <w:r>
-        <w:t xml:space="preserve"> </w:t>
-      </w:r>
-      <w:r>
-        <w:rPr>
-          <w:b/>
-          <w:bCs/>
-        </w:rPr>
-        <w:t xml:space="preserve">évitez les cellules fusionnées</w:t>
-      </w:r>
-      <w:r>
-        <w:t xml:space="preserve"> </w:t>
-      </w:r>
-      <w:r>
-        <w:t xml:space="preserve">et les tableaux imbriqués qui gênent la lecture par lecteur d’écran. Sur mobile,</w:t>
-      </w:r>
-      <w:r>
-        <w:t xml:space="preserve"> </w:t>
-      </w:r>
-      <w:r>
-        <w:rPr>
-          <w:b/>
-          <w:bCs/>
-        </w:rPr>
-        <w:t xml:space="preserve">limitez le nombre de colonnes à l’essentiel</w:t>
-      </w:r>
-      <w:r>
-        <w:t xml:space="preserve"> </w:t>
-      </w:r>
-      <w:r>
-        <w:t xml:space="preserve">et laissez le défilement horizontal faire son travail. Règle d’or : si vous ne pouvez pas</w:t>
-      </w:r>
-      <w:r>
-        <w:t xml:space="preserve"> </w:t>
-      </w:r>
-      <w:r>
-        <w:rPr>
-          <w:b/>
-          <w:bCs/>
-        </w:rPr>
-        <w:t xml:space="preserve">nommer chaque colonne</w:t>
-      </w:r>
-      <w:r>
-        <w:t xml:space="preserve"> </w:t>
-      </w:r>
-      <w:r>
-        <w:t xml:space="preserve">ni justifier que les lignes se</w:t>
-      </w:r>
-      <w:r>
-        <w:t xml:space="preserve"> </w:t>
-      </w:r>
-      <w:r>
-        <w:rPr>
-          <w:b/>
-          <w:bCs/>
-        </w:rPr>
-        <w:t xml:space="preserve">comparent</w:t>
-      </w:r>
-      <w:r>
-        <w:t xml:space="preserve">, ce n’est pas un tableau.</w:t>
-      </w:r>
-    </w:p>
-    <w:bookmarkEnd w:id="151"/>
-    <w:bookmarkStart w:id="155" w:name="X67192766853913f23684d1dc1ffa2acd988ee5c"/>
+    <w:bookmarkStart w:id="150" w:name="X67192766853913f23684d1dc1ffa2acd988ee5c"/>
     <w:p>
       <w:pPr>
         <w:pStyle w:val="Heading4"/>
@@ -16287,72 +16287,9 @@
         <w:t xml:space="preserve">ce détail vide.</w:t>
       </w:r>
     </w:p>
-    <w:p>
-      <w:pPr>
-        <w:pStyle w:val="CaptionedFigure"/>
-        <w:numPr>
-          <w:ilvl w:val="0"/>
-          <w:numId w:val="1000"/>
-        </w:numPr>
-      </w:pPr>
-      <w:r>
-        <w:drawing>
-          <wp:inline>
-            <wp:extent cx="5334000" cy="1699997"/>
-            <wp:effectExtent b="0" l="0" r="0" t="0"/>
-            <wp:docPr descr="Le composant Téléchargement inséré, avec les zones adresse, intitulé et « Format – Poids » à remplacer" title="" id="153" name="Picture"/>
-            <a:graphic>
-              <a:graphicData uri="http://schemas.openxmlformats.org/drawingml/2006/picture">
-                <pic:pic>
-                  <pic:nvPicPr>
-                    <pic:cNvPr descr="img/c5-telechargement-champs.png" id="154" name="Picture"/>
-                    <pic:cNvPicPr>
-                      <a:picLocks noChangeArrowheads="1" noChangeAspect="1"/>
-                    </pic:cNvPicPr>
-                  </pic:nvPicPr>
-                  <pic:blipFill>
-                    <a:blip r:embed="rId152"/>
-                    <a:stretch>
-                      <a:fillRect/>
-                    </a:stretch>
-                  </pic:blipFill>
-                  <pic:spPr bwMode="auto">
-                    <a:xfrm>
-                      <a:off x="0" y="0"/>
-                      <a:ext cx="5334000" cy="1699997"/>
-                    </a:xfrm>
-                    <a:prstGeom prst="rect">
-                      <a:avLst/>
-                    </a:prstGeom>
-                    <a:noFill/>
-                    <a:ln w="9525">
-                      <a:noFill/>
-                      <a:headEnd/>
-                      <a:tailEnd/>
-                    </a:ln>
-                  </pic:spPr>
-                </pic:pic>
-              </a:graphicData>
-            </a:graphic>
-          </wp:inline>
-        </w:drawing>
-      </w:r>
-    </w:p>
-    <w:p>
-      <w:pPr>
-        <w:pStyle w:val="ImageCaption"/>
-        <w:numPr>
-          <w:ilvl w:val="0"/>
-          <w:numId w:val="1000"/>
-        </w:numPr>
-      </w:pPr>
-      <w:r>
-        <w:t xml:space="preserve">Le composant Téléchargement inséré, avec les zones adresse, intitulé et « Format – Poids » à remplacer</w:t>
-      </w:r>
-    </w:p>
-    <w:bookmarkEnd w:id="155"/>
-    <w:bookmarkEnd w:id="156"/>
-    <w:bookmarkStart w:id="157" w:name="à-retenir-2"/>
+    <w:bookmarkEnd w:id="150"/>
+    <w:bookmarkEnd w:id="151"/>
+    <w:bookmarkStart w:id="152" w:name="à-retenir-2"/>
     <w:p>
       <w:pPr>
         <w:pStyle w:val="Heading3"/>
@@ -16923,9 +16860,9 @@
         </w:pict>
       </w:r>
     </w:p>
-    <w:bookmarkEnd w:id="157"/>
-    <w:bookmarkEnd w:id="158"/>
-    <w:bookmarkStart w:id="170" w:name="prévisualiser-et-vérifier"/>
+    <w:bookmarkEnd w:id="152"/>
+    <w:bookmarkEnd w:id="153"/>
+    <w:bookmarkStart w:id="165" w:name="prévisualiser-et-vérifier"/>
     <w:p>
       <w:pPr>
         <w:pStyle w:val="Heading2"/>
@@ -16999,11 +16936,11 @@
       <w:pPr>
         <w:pStyle w:val="Heading3"/>
       </w:pPr>
-      <w:bookmarkStart w:id="159" w:name="X683b8eebc2172dab8aab4b5a8f98d8e1f095645"/>
+      <w:bookmarkStart w:id="154" w:name="X683b8eebc2172dab8aab4b5a8f98d8e1f095645"/>
       <w:r>
         <w:t xml:space="preserve">⚠️ Vérifiez la déclaration de conformité RGAA avant activation</w:t>
       </w:r>
-      <w:bookmarkEnd w:id="159"/>
+      <w:bookmarkEnd w:id="154"/>
     </w:p>
     <w:p>
       <w:pPr>
@@ -17119,7 +17056,7 @@
         <w:t xml:space="preserve">de votre contenu éditorial — il ne signe pas l’audit à votre place.</w:t>
       </w:r>
     </w:p>
-    <w:bookmarkStart w:id="163" w:name="trois-niveaux-daperçu"/>
+    <w:bookmarkStart w:id="158" w:name="trois-niveaux-daperçu"/>
     <w:p>
       <w:pPr>
         <w:pStyle w:val="Heading3"/>
@@ -17209,20 +17146,20 @@
       <w:r>
         <w:drawing>
           <wp:inline>
-            <wp:extent cx="5334000" cy="696685"/>
+            <wp:extent cx="5334000" cy="406102"/>
             <wp:effectExtent b="0" l="0" r="0" t="0"/>
-            <wp:docPr descr="Boutons d’aperçu question, groupe et questionnaire complet dans LimeSurvey" title="" id="161" name="Picture"/>
+            <wp:docPr descr="Boutons d’aperçu question, groupe et questionnaire complet dans LimeSurvey" title="" id="156" name="Picture"/>
             <a:graphic>
               <a:graphicData uri="http://schemas.openxmlformats.org/drawingml/2006/picture">
                 <pic:pic>
                   <pic:nvPicPr>
-                    <pic:cNvPr descr="img/c6-boutons-apercu.png" id="162" name="Picture"/>
+                    <pic:cNvPr descr="img/8-apercu-complet-vs-question.png" id="157" name="Picture"/>
                     <pic:cNvPicPr>
                       <a:picLocks noChangeArrowheads="1" noChangeAspect="1"/>
                     </pic:cNvPicPr>
                   </pic:nvPicPr>
                   <pic:blipFill>
-                    <a:blip r:embed="rId160"/>
+                    <a:blip r:embed="rId155"/>
                     <a:stretch>
                       <a:fillRect/>
                     </a:stretch>
@@ -17230,7 +17167,7 @@
                   <pic:spPr bwMode="auto">
                     <a:xfrm>
                       <a:off x="0" y="0"/>
-                      <a:ext cx="5334000" cy="696685"/>
+                      <a:ext cx="5334000" cy="406102"/>
                     </a:xfrm>
                     <a:prstGeom prst="rect">
                       <a:avLst/>
@@ -17265,8 +17202,8 @@
         <w:t xml:space="preserve">L’aperçu du questionnaire complet ne compte pas de réponse réelle et ne nécessite pas d’activer le questionnaire : vous pouvez le lancer autant de fois que nécessaire pendant la construction.</w:t>
       </w:r>
     </w:p>
-    <w:bookmarkEnd w:id="163"/>
-    <w:bookmarkStart w:id="164" w:name="lire-les-repères-contributeur"/>
+    <w:bookmarkEnd w:id="158"/>
+    <w:bookmarkStart w:id="159" w:name="lire-les-repères-contributeur"/>
     <w:p>
       <w:pPr>
         <w:pStyle w:val="Heading3"/>
@@ -17416,8 +17353,8 @@
         <w:t xml:space="preserve">Titres de groupe, libellés de question, aides : l’ordre visuel doit refléter l’ordre logique. Un aperçu où « tout se ressemble » est un signal d’alerte.</w:t>
       </w:r>
     </w:p>
-    <w:bookmarkEnd w:id="164"/>
-    <w:bookmarkStart w:id="168" w:name="Xa4cd5dd2096a0984104a4c99fa77346301e5a90"/>
+    <w:bookmarkEnd w:id="159"/>
+    <w:bookmarkStart w:id="163" w:name="Xa4cd5dd2096a0984104a4c99fa77346301e5a90"/>
     <w:p>
       <w:pPr>
         <w:pStyle w:val="Heading3"/>
@@ -17523,20 +17460,20 @@
       <w:r>
         <w:drawing>
           <wp:inline>
-            <wp:extent cx="5334000" cy="1195903"/>
+            <wp:extent cx="5334000" cy="1855585"/>
             <wp:effectExtent b="0" l="0" r="0" t="0"/>
-            <wp:docPr descr="Un accordéon replié dans l’aperçu répondant, puis déplié après clic" title="" id="166" name="Picture"/>
+            <wp:docPr descr="Un accordéon replié dans l’aperçu répondant, puis déplié après clic" title="" id="161" name="Picture"/>
             <a:graphic>
               <a:graphicData uri="http://schemas.openxmlformats.org/drawingml/2006/picture">
                 <pic:pic>
                   <pic:nvPicPr>
-                    <pic:cNvPr descr="img/c6-accordeon-apercu.png" id="167" name="Picture"/>
+                    <pic:cNvPr descr="img/c6-accordeon-apercu.png" id="162" name="Picture"/>
                     <pic:cNvPicPr>
                       <a:picLocks noChangeArrowheads="1" noChangeAspect="1"/>
                     </pic:cNvPicPr>
                   </pic:nvPicPr>
                   <pic:blipFill>
-                    <a:blip r:embed="rId165"/>
+                    <a:blip r:embed="rId160"/>
                     <a:stretch>
                       <a:fillRect/>
                     </a:stretch>
@@ -17544,7 +17481,7 @@
                   <pic:spPr bwMode="auto">
                     <a:xfrm>
                       <a:off x="0" y="0"/>
-                      <a:ext cx="5334000" cy="1195903"/>
+                      <a:ext cx="5334000" cy="1855585"/>
                     </a:xfrm>
                     <a:prstGeom prst="rect">
                       <a:avLst/>
@@ -17595,8 +17532,8 @@
         <w:t xml:space="preserve">Si vous voulez vérifier qu’une information est bien lisible une fois dépliée, cliquez réellement sur l’accordéon dans l’aperçu.</w:t>
       </w:r>
     </w:p>
-    <w:bookmarkEnd w:id="168"/>
-    <w:bookmarkStart w:id="169" w:name="votre-vérification-avant-activation"/>
+    <w:bookmarkEnd w:id="163"/>
+    <w:bookmarkStart w:id="164" w:name="votre-vérification-avant-activation"/>
     <w:p>
       <w:pPr>
         <w:pStyle w:val="Heading3"/>
@@ -17757,9 +17694,9 @@
         </w:pict>
       </w:r>
     </w:p>
-    <w:bookmarkEnd w:id="169"/>
-    <w:bookmarkEnd w:id="170"/>
-    <w:bookmarkStart w:id="177" w:name="recettes-rapides"/>
+    <w:bookmarkEnd w:id="164"/>
+    <w:bookmarkEnd w:id="165"/>
+    <w:bookmarkStart w:id="171" w:name="recettes-rapides"/>
     <w:p>
       <w:pPr>
         <w:pStyle w:val="Heading2"/>
@@ -17860,7 +17797,7 @@
         <w:t xml:space="preserve">de la question (ou dans un texte d’introduction de groupe), jamais dans le libellé.</w:t>
       </w:r>
     </w:p>
-    <w:bookmarkStart w:id="174" w:name="la-table-je-veux-utilisez"/>
+    <w:bookmarkStart w:id="168" w:name="la-table-je-veux-utilisez"/>
     <w:p>
       <w:pPr>
         <w:pStyle w:val="Heading3"/>
@@ -18564,20 +18501,20 @@
       <w:r>
         <w:drawing>
           <wp:inline>
-            <wp:extent cx="3378200" cy="5638800"/>
+            <wp:extent cx="4258674" cy="7583765"/>
             <wp:effectExtent b="0" l="0" r="0" t="0"/>
-            <wp:docPr descr="Palette Modèles déroulée dans l’éditeur" title="" id="172" name="Picture"/>
+            <wp:docPr descr="Palette Modèles déroulée dans l’éditeur" title="" id="166" name="Picture"/>
             <a:graphic>
               <a:graphicData uri="http://schemas.openxmlformats.org/drawingml/2006/picture">
                 <pic:pic>
                   <pic:nvPicPr>
-                    <pic:cNvPr descr="img/c7-palette-templates.png" id="173" name="Picture"/>
+                    <pic:cNvPr descr="img/annexeB-palette.png" id="167" name="Picture"/>
                     <pic:cNvPicPr>
                       <a:picLocks noChangeArrowheads="1" noChangeAspect="1"/>
                     </pic:cNvPicPr>
                   </pic:nvPicPr>
                   <pic:blipFill>
-                    <a:blip r:embed="rId171"/>
+                    <a:blip r:embed="rId140"/>
                     <a:stretch>
                       <a:fillRect/>
                     </a:stretch>
@@ -18585,7 +18522,7 @@
                   <pic:spPr bwMode="auto">
                     <a:xfrm>
                       <a:off x="0" y="0"/>
-                      <a:ext cx="3378200" cy="5638800"/>
+                      <a:ext cx="4258674" cy="7583765"/>
                     </a:xfrm>
                     <a:prstGeom prst="rect">
                       <a:avLst/>
@@ -18612,8 +18549,8 @@
         <w:t xml:space="preserve">Palette Modèles déroulée dans l’éditeur</w:t>
       </w:r>
     </w:p>
-    <w:bookmarkEnd w:id="174"/>
-    <w:bookmarkStart w:id="175" w:name="X9cddb459724db2708332cddce09c5ae90efc4fc"/>
+    <w:bookmarkEnd w:id="168"/>
+    <w:bookmarkStart w:id="169" w:name="X9cddb459724db2708332cddce09c5ae90efc4fc"/>
     <w:p>
       <w:pPr>
         <w:pStyle w:val="Heading3"/>
@@ -19102,8 +19039,8 @@
         <w:t xml:space="preserve">un lien nu : le format et le poids font partie du sens.</w:t>
       </w:r>
     </w:p>
-    <w:bookmarkEnd w:id="175"/>
-    <w:bookmarkStart w:id="176" w:name="les-réflexes-à-garder"/>
+    <w:bookmarkEnd w:id="169"/>
+    <w:bookmarkStart w:id="170" w:name="les-réflexes-à-garder"/>
     <w:p>
       <w:pPr>
         <w:pStyle w:val="Heading3"/>
@@ -19286,9 +19223,9 @@
         </w:pict>
       </w:r>
     </w:p>
-    <w:bookmarkEnd w:id="176"/>
-    <w:bookmarkEnd w:id="177"/>
-    <w:bookmarkStart w:id="192" w:name="pièges-et-faq"/>
+    <w:bookmarkEnd w:id="170"/>
+    <w:bookmarkEnd w:id="171"/>
+    <w:bookmarkStart w:id="184" w:name="pièges-et-faq"/>
     <w:p>
       <w:pPr>
         <w:pStyle w:val="Heading2"/>
@@ -19334,7 +19271,7 @@
         <w:t xml:space="preserve">.</w:t>
       </w:r>
     </w:p>
-    <w:bookmarkStart w:id="181" w:name="X308782317bc2c997a1b10df2d42a0c4c997e9c3"/>
+    <w:bookmarkStart w:id="174" w:name="X308782317bc2c997a1b10df2d42a0c4c997e9c3"/>
     <w:p>
       <w:pPr>
         <w:pStyle w:val="Heading3"/>
@@ -19567,20 +19504,20 @@
       <w:r>
         <w:drawing>
           <wp:inline>
-            <wp:extent cx="5334000" cy="565013"/>
+            <wp:extent cx="5334000" cy="550015"/>
             <wp:effectExtent b="0" l="0" r="0" t="0"/>
-            <wp:docPr descr="L’alerte et le badge DSFR remplacent une couleur posée à la main" title="" id="179" name="Picture"/>
+            <wp:docPr descr="L’alerte et le badge DSFR remplacent une couleur posée à la main" title="" id="172" name="Picture"/>
             <a:graphic>
               <a:graphicData uri="http://schemas.openxmlformats.org/drawingml/2006/picture">
                 <pic:pic>
                   <pic:nvPicPr>
-                    <pic:cNvPr descr="img/8-couleur-vers-composant.png" id="180" name="Picture"/>
+                    <pic:cNvPr descr="img/8-couleur-vers-composant.png" id="173" name="Picture"/>
                     <pic:cNvPicPr>
                       <a:picLocks noChangeArrowheads="1" noChangeAspect="1"/>
                     </pic:cNvPicPr>
                   </pic:nvPicPr>
                   <pic:blipFill>
-                    <a:blip r:embed="rId178"/>
+                    <a:blip r:embed="rId38"/>
                     <a:stretch>
                       <a:fillRect/>
                     </a:stretch>
@@ -19588,7 +19525,7 @@
                   <pic:spPr bwMode="auto">
                     <a:xfrm>
                       <a:off x="0" y="0"/>
-                      <a:ext cx="5334000" cy="565013"/>
+                      <a:ext cx="5334000" cy="550015"/>
                     </a:xfrm>
                     <a:prstGeom prst="rect">
                       <a:avLst/>
@@ -19615,8 +19552,8 @@
         <w:t xml:space="preserve">L’alerte et le badge DSFR remplacent une couleur posée à la main</w:t>
       </w:r>
     </w:p>
-    <w:bookmarkEnd w:id="181"/>
-    <w:bookmarkStart w:id="185" w:name="X46caf23bf67e0b3981e3211f040e75eb6b0a520"/>
+    <w:bookmarkEnd w:id="174"/>
+    <w:bookmarkStart w:id="178" w:name="X46caf23bf67e0b3981e3211f040e75eb6b0a520"/>
     <w:p>
       <w:pPr>
         <w:pStyle w:val="Heading3"/>
@@ -19784,20 +19721,20 @@
       <w:r>
         <w:drawing>
           <wp:inline>
-            <wp:extent cx="5334000" cy="1493520"/>
+            <wp:extent cx="5334000" cy="2582778"/>
             <wp:effectExtent b="0" l="0" r="0" t="0"/>
-            <wp:docPr descr="Le tableau déplacé du libellé vers le champ Aide" title="" id="183" name="Picture"/>
+            <wp:docPr descr="Le tableau déplacé du libellé vers le champ Aide" title="" id="176" name="Picture"/>
             <a:graphic>
               <a:graphicData uri="http://schemas.openxmlformats.org/drawingml/2006/picture">
                 <pic:pic>
                   <pic:nvPicPr>
-                    <pic:cNvPr descr="img/8-tableau-vers-aide.png" id="184" name="Picture"/>
+                    <pic:cNvPr descr="img/8-tableau-vers-aide.png" id="177" name="Picture"/>
                     <pic:cNvPicPr>
                       <a:picLocks noChangeArrowheads="1" noChangeAspect="1"/>
                     </pic:cNvPicPr>
                   </pic:nvPicPr>
                   <pic:blipFill>
-                    <a:blip r:embed="rId182"/>
+                    <a:blip r:embed="rId175"/>
                     <a:stretch>
                       <a:fillRect/>
                     </a:stretch>
@@ -19805,7 +19742,7 @@
                   <pic:spPr bwMode="auto">
                     <a:xfrm>
                       <a:off x="0" y="0"/>
-                      <a:ext cx="5334000" cy="1493520"/>
+                      <a:ext cx="5334000" cy="2582778"/>
                     </a:xfrm>
                     <a:prstGeom prst="rect">
                       <a:avLst/>
@@ -19832,8 +19769,8 @@
         <w:t xml:space="preserve">Le tableau déplacé du libellé vers le champ Aide</w:t>
       </w:r>
     </w:p>
-    <w:bookmarkEnd w:id="185"/>
-    <w:bookmarkStart w:id="189" w:name="X3390c2dbc6df4b74807cfb49942de19c387e12e"/>
+    <w:bookmarkEnd w:id="178"/>
+    <w:bookmarkStart w:id="181" w:name="X3390c2dbc6df4b74807cfb49942de19c387e12e"/>
     <w:p>
       <w:pPr>
         <w:pStyle w:val="Heading3"/>
@@ -19899,20 +19836,20 @@
       <w:r>
         <w:drawing>
           <wp:inline>
-            <wp:extent cx="5334000" cy="696685"/>
+            <wp:extent cx="5334000" cy="406102"/>
             <wp:effectExtent b="0" l="0" r="0" t="0"/>
-            <wp:docPr descr="Où cliquer pour l’aperçu complet plutôt que l’aperçu d’une seule question" title="" id="187" name="Picture"/>
+            <wp:docPr descr="Où cliquer pour l’aperçu complet plutôt que l’aperçu d’une seule question" title="" id="179" name="Picture"/>
             <a:graphic>
               <a:graphicData uri="http://schemas.openxmlformats.org/drawingml/2006/picture">
                 <pic:pic>
                   <pic:nvPicPr>
-                    <pic:cNvPr descr="img/8-apercu-complet-vs-question.png" id="188" name="Picture"/>
+                    <pic:cNvPr descr="img/8-apercu-complet-vs-question.png" id="180" name="Picture"/>
                     <pic:cNvPicPr>
                       <a:picLocks noChangeArrowheads="1" noChangeAspect="1"/>
                     </pic:cNvPicPr>
                   </pic:nvPicPr>
                   <pic:blipFill>
-                    <a:blip r:embed="rId186"/>
+                    <a:blip r:embed="rId155"/>
                     <a:stretch>
                       <a:fillRect/>
                     </a:stretch>
@@ -19920,7 +19857,7 @@
                   <pic:spPr bwMode="auto">
                     <a:xfrm>
                       <a:off x="0" y="0"/>
-                      <a:ext cx="5334000" cy="696685"/>
+                      <a:ext cx="5334000" cy="406102"/>
                     </a:xfrm>
                     <a:prstGeom prst="rect">
                       <a:avLst/>
@@ -19947,8 +19884,8 @@
         <w:t xml:space="preserve">Où cliquer pour l’aperçu complet plutôt que l’aperçu d’une seule question</w:t>
       </w:r>
     </w:p>
-    <w:bookmarkEnd w:id="189"/>
-    <w:bookmarkStart w:id="190" w:name="X1a6c6d7ce7ba13eaf1ec74e83a74a4288a24df7"/>
+    <w:bookmarkEnd w:id="181"/>
+    <w:bookmarkStart w:id="182" w:name="X1a6c6d7ce7ba13eaf1ec74e83a74a4288a24df7"/>
     <w:p>
       <w:pPr>
         <w:pStyle w:val="Heading3"/>
@@ -20147,8 +20084,8 @@
         <w:t xml:space="preserve">.</w:t>
       </w:r>
     </w:p>
-    <w:bookmarkEnd w:id="190"/>
-    <w:bookmarkStart w:id="191" w:name="en-bref"/>
+    <w:bookmarkEnd w:id="182"/>
+    <w:bookmarkStart w:id="183" w:name="en-bref"/>
     <w:p>
       <w:pPr>
         <w:pStyle w:val="Heading3"/>
@@ -20535,9 +20472,9 @@
         </w:pict>
       </w:r>
     </w:p>
-    <w:bookmarkEnd w:id="191"/>
-    <w:bookmarkEnd w:id="192"/>
-    <w:bookmarkStart w:id="201" w:name="aide-et-remontées"/>
+    <w:bookmarkEnd w:id="183"/>
+    <w:bookmarkEnd w:id="184"/>
+    <w:bookmarkStart w:id="190" w:name="aide-et-remontées"/>
     <w:p>
       <w:pPr>
         <w:pStyle w:val="Heading2"/>
@@ -20596,7 +20533,7 @@
         <w:t xml:space="preserve">, selon que votre demande est publique ou sensible.</w:t>
       </w:r>
     </w:p>
-    <w:bookmarkStart w:id="193" w:name="avant-de-demander-les-trois-réflexes"/>
+    <w:bookmarkStart w:id="185" w:name="avant-de-demander-les-trois-réflexes"/>
     <w:p>
       <w:pPr>
         <w:pStyle w:val="Heading3"/>
@@ -20687,8 +20624,8 @@
         <w:t xml:space="preserve">Si le doute persiste, passez à la suite.</w:t>
       </w:r>
     </w:p>
-    <w:bookmarkEnd w:id="193"/>
-    <w:bookmarkStart w:id="194" w:name="distinguer-le-public-du-sensible"/>
+    <w:bookmarkEnd w:id="185"/>
+    <w:bookmarkStart w:id="186" w:name="distinguer-le-public-du-sensible"/>
     <w:p>
       <w:pPr>
         <w:pStyle w:val="Heading3"/>
@@ -20841,8 +20778,8 @@
         <w:t xml:space="preserve">(capture, export, lien privé), elle est interne. Si vous pouvez la formuler avec un exemple neutre (« un accordéon dans l’aide d’une question à choix multiple ne s’ouvre pas »), elle peut être publique.</w:t>
       </w:r>
     </w:p>
-    <w:bookmarkEnd w:id="194"/>
-    <w:bookmarkStart w:id="198" w:name="le-canal-public-le-dépôt-github-du-thème"/>
+    <w:bookmarkEnd w:id="186"/>
+    <w:bookmarkStart w:id="187" w:name="le-canal-public-le-dépôt-github-du-thème"/>
     <w:p>
       <w:pPr>
         <w:pStyle w:val="Heading3"/>
@@ -21095,61 +21032,6 @@
     </w:p>
     <w:p>
       <w:pPr>
-        <w:pStyle w:val="CaptionedFigure"/>
-      </w:pPr>
-      <w:r>
-        <w:drawing>
-          <wp:inline>
-            <wp:extent cx="5334000" cy="1353910"/>
-            <wp:effectExtent b="0" l="0" r="0" t="0"/>
-            <wp:docPr descr="Onglet Issues du dépôt GitHub du thème, avec le bouton de création d’un nouveau ticket" title="" id="196" name="Picture"/>
-            <a:graphic>
-              <a:graphicData uri="http://schemas.openxmlformats.org/drawingml/2006/picture">
-                <pic:pic>
-                  <pic:nvPicPr>
-                    <pic:cNvPr descr="img/9-github-issues.png" id="197" name="Picture"/>
-                    <pic:cNvPicPr>
-                      <a:picLocks noChangeArrowheads="1" noChangeAspect="1"/>
-                    </pic:cNvPicPr>
-                  </pic:nvPicPr>
-                  <pic:blipFill>
-                    <a:blip r:embed="rId195"/>
-                    <a:stretch>
-                      <a:fillRect/>
-                    </a:stretch>
-                  </pic:blipFill>
-                  <pic:spPr bwMode="auto">
-                    <a:xfrm>
-                      <a:off x="0" y="0"/>
-                      <a:ext cx="5334000" cy="1353910"/>
-                    </a:xfrm>
-                    <a:prstGeom prst="rect">
-                      <a:avLst/>
-                    </a:prstGeom>
-                    <a:noFill/>
-                    <a:ln w="9525">
-                      <a:noFill/>
-                      <a:headEnd/>
-                      <a:tailEnd/>
-                    </a:ln>
-                  </pic:spPr>
-                </pic:pic>
-              </a:graphicData>
-            </a:graphic>
-          </wp:inline>
-        </w:drawing>
-      </w:r>
-    </w:p>
-    <w:p>
-      <w:pPr>
-        <w:pStyle w:val="ImageCaption"/>
-      </w:pPr>
-      <w:r>
-        <w:t xml:space="preserve">Onglet Issues du dépôt GitHub du thème, avec le bouton de création d’un nouveau ticket</w:t>
-      </w:r>
-    </w:p>
-    <w:p>
-      <w:pPr>
         <w:pStyle w:val="BodyText"/>
       </w:pPr>
       <w:r>
@@ -21172,8 +21054,8 @@
         <w:t xml:space="preserve">: votre problème est peut-être déjà signalé. Dans ce cas, ajoutez plutôt un commentaire (« même souci de mon côté ») — c’est plus utile qu’un doublon.</w:t>
       </w:r>
     </w:p>
-    <w:bookmarkEnd w:id="198"/>
-    <w:bookmarkStart w:id="199" w:name="X67b5639cfee8345352a5ba6ecc3785ca1a3b597"/>
+    <w:bookmarkEnd w:id="187"/>
+    <w:bookmarkStart w:id="188" w:name="X67b5639cfee8345352a5ba6ecc3785ca1a3b597"/>
     <w:p>
       <w:pPr>
         <w:pStyle w:val="Heading3"/>
@@ -21370,8 +21252,8 @@
         <w:t xml:space="preserve">Sur ce canal interne, vous pouvez transmettre sans risque une capture d’écran de votre question, l’identifiant de votre questionnaire ou un lien d’aperçu : ces informations restent dans le périmètre de confiance de votre structure.</w:t>
       </w:r>
     </w:p>
-    <w:bookmarkEnd w:id="199"/>
-    <w:bookmarkStart w:id="200" w:name="en-résumé-1"/>
+    <w:bookmarkEnd w:id="188"/>
+    <w:bookmarkStart w:id="189" w:name="en-résumé-1"/>
     <w:p>
       <w:pPr>
         <w:pStyle w:val="Heading3"/>
@@ -21646,9 +21528,9 @@
         </w:pict>
       </w:r>
     </w:p>
-    <w:bookmarkEnd w:id="200"/>
-    <w:bookmarkEnd w:id="201"/>
-    <w:bookmarkStart w:id="212" w:name="annexe-a-mise-en-place-administrateur"/>
+    <w:bookmarkEnd w:id="189"/>
+    <w:bookmarkEnd w:id="190"/>
+    <w:bookmarkStart w:id="201" w:name="annexe-a-mise-en-place-administrateur"/>
     <w:p>
       <w:pPr>
         <w:pStyle w:val="Heading2"/>
@@ -21757,7 +21639,7 @@
         <w:t xml:space="preserve">qui fournit les composants et mises en forme DSFR de l’éditeur.</w:t>
       </w:r>
     </w:p>
-    <w:bookmarkStart w:id="202" w:name="a.1-déposer-le-thème-dsfr"/>
+    <w:bookmarkStart w:id="191" w:name="a.1-déposer-le-thème-dsfr"/>
     <w:p>
       <w:pPr>
         <w:pStyle w:val="Heading3"/>
@@ -21822,8 +21704,8 @@
         <w:t xml:space="preserve">Pourquoi le filesystem plutôt que l’upload ? Parce qu’une mise à jour du thème (nouvelle version) se résume alors à remplacer les fichiers sur le serveur, sans manipulation dans l’interface et sans risque d’écraser une personnalisation par erreur.</w:t>
       </w:r>
     </w:p>
-    <w:bookmarkEnd w:id="202"/>
-    <w:bookmarkStart w:id="206" w:name="X397a00987359a4eef248c6920564fd29d4cbd0f"/>
+    <w:bookmarkEnd w:id="191"/>
+    <w:bookmarkStart w:id="195" w:name="X397a00987359a4eef248c6920564fd29d4cbd0f"/>
     <w:p>
       <w:pPr>
         <w:pStyle w:val="Heading3"/>
@@ -21903,20 +21785,20 @@
       <w:r>
         <w:drawing>
           <wp:inline>
-            <wp:extent cx="5334000" cy="3050641"/>
+            <wp:extent cx="4936481" cy="2903060"/>
             <wp:effectExtent b="0" l="0" r="0" t="0"/>
-            <wp:docPr descr="Sélection du thème DSFR dans les réglages du questionnaire" title="" id="204" name="Picture"/>
+            <wp:docPr descr="Sélection du thème DSFR dans les réglages du questionnaire" title="" id="193" name="Picture"/>
             <a:graphic>
               <a:graphicData uri="http://schemas.openxmlformats.org/drawingml/2006/picture">
                 <pic:pic>
                   <pic:nvPicPr>
-                    <pic:cNvPr descr="img/a2-selection-theme.png" id="205" name="Picture"/>
+                    <pic:cNvPr descr="img/a2-selection-theme.png" id="194" name="Picture"/>
                     <pic:cNvPicPr>
                       <a:picLocks noChangeArrowheads="1" noChangeAspect="1"/>
                     </pic:cNvPicPr>
                   </pic:nvPicPr>
                   <pic:blipFill>
-                    <a:blip r:embed="rId203"/>
+                    <a:blip r:embed="rId192"/>
                     <a:stretch>
                       <a:fillRect/>
                     </a:stretch>
@@ -21924,7 +21806,7 @@
                   <pic:spPr bwMode="auto">
                     <a:xfrm>
                       <a:off x="0" y="0"/>
-                      <a:ext cx="5334000" cy="3050641"/>
+                      <a:ext cx="4936481" cy="2903060"/>
                     </a:xfrm>
                     <a:prstGeom prst="rect">
                       <a:avLst/>
@@ -21951,8 +21833,8 @@
         <w:t xml:space="preserve">Sélection du thème DSFR dans les réglages du questionnaire</w:t>
       </w:r>
     </w:p>
-    <w:bookmarkEnd w:id="206"/>
-    <w:bookmarkStart w:id="210" w:name="a.3-activer-le-plugin-ckeditordsfr"/>
+    <w:bookmarkEnd w:id="195"/>
+    <w:bookmarkStart w:id="199" w:name="a.3-activer-le-plugin-ckeditordsfr"/>
     <w:p>
       <w:pPr>
         <w:pStyle w:val="Heading3"/>
@@ -22217,20 +22099,20 @@
       <w:r>
         <w:drawing>
           <wp:inline>
-            <wp:extent cx="5334000" cy="1090238"/>
+            <wp:extent cx="5334000" cy="2637256"/>
             <wp:effectExtent b="0" l="0" r="0" t="0"/>
-            <wp:docPr descr="Le plugin CKEditorDSFR installé et activé dans la liste des plugins" title="" id="208" name="Picture"/>
+            <wp:docPr descr="Le plugin CKEditorDSFR installé et activé dans la liste des plugins" title="" id="197" name="Picture"/>
             <a:graphic>
               <a:graphicData uri="http://schemas.openxmlformats.org/drawingml/2006/picture">
                 <pic:pic>
                   <pic:nvPicPr>
-                    <pic:cNvPr descr="img/a3-plugin-active.png" id="209" name="Picture"/>
+                    <pic:cNvPr descr="img/a3-plugin-active.png" id="198" name="Picture"/>
                     <pic:cNvPicPr>
                       <a:picLocks noChangeArrowheads="1" noChangeAspect="1"/>
                     </pic:cNvPicPr>
                   </pic:nvPicPr>
                   <pic:blipFill>
-                    <a:blip r:embed="rId207"/>
+                    <a:blip r:embed="rId196"/>
                     <a:stretch>
                       <a:fillRect/>
                     </a:stretch>
@@ -22238,7 +22120,7 @@
                   <pic:spPr bwMode="auto">
                     <a:xfrm>
                       <a:off x="0" y="0"/>
-                      <a:ext cx="5334000" cy="1090238"/>
+                      <a:ext cx="5334000" cy="2637256"/>
                     </a:xfrm>
                     <a:prstGeom prst="rect">
                       <a:avLst/>
@@ -22265,8 +22147,8 @@
         <w:t xml:space="preserve">Le plugin CKEditorDSFR installé et activé dans la liste des plugins</w:t>
       </w:r>
     </w:p>
-    <w:bookmarkEnd w:id="210"/>
-    <w:bookmarkStart w:id="211" w:name="Xc8dfb43502fbebce76dce60b494f128f82fb445"/>
+    <w:bookmarkEnd w:id="199"/>
+    <w:bookmarkStart w:id="200" w:name="Xc8dfb43502fbebce76dce60b494f128f82fb445"/>
     <w:p>
       <w:pPr>
         <w:pStyle w:val="Heading3"/>
@@ -22406,9 +22288,9 @@
         </w:pict>
       </w:r>
     </w:p>
-    <w:bookmarkEnd w:id="211"/>
-    <w:bookmarkEnd w:id="212"/>
-    <w:bookmarkStart w:id="238" w:name="annexe-b-référentiel-des-composants-dsfr"/>
+    <w:bookmarkEnd w:id="200"/>
+    <w:bookmarkEnd w:id="201"/>
+    <w:bookmarkStart w:id="223" w:name="annexe-b-référentiel-des-composants-dsfr"/>
     <w:p>
       <w:pPr>
         <w:pStyle w:val="Heading2"/>
@@ -22659,20 +22541,20 @@
       <w:r>
         <w:drawing>
           <wp:inline>
-            <wp:extent cx="3378200" cy="5638800"/>
+            <wp:extent cx="4258674" cy="7583765"/>
             <wp:effectExtent b="0" l="0" r="0" t="0"/>
-            <wp:docPr descr="Palette des composants DSFR dans l’éditeur" title="" id="214" name="Picture"/>
+            <wp:docPr descr="Palette des composants DSFR dans l’éditeur" title="" id="202" name="Picture"/>
             <a:graphic>
               <a:graphicData uri="http://schemas.openxmlformats.org/drawingml/2006/picture">
                 <pic:pic>
                   <pic:nvPicPr>
-                    <pic:cNvPr descr="img/annexeB-palette.png" id="215" name="Picture"/>
+                    <pic:cNvPr descr="img/annexeB-palette.png" id="203" name="Picture"/>
                     <pic:cNvPicPr>
                       <a:picLocks noChangeArrowheads="1" noChangeAspect="1"/>
                     </pic:cNvPicPr>
                   </pic:nvPicPr>
                   <pic:blipFill>
-                    <a:blip r:embed="rId213"/>
+                    <a:blip r:embed="rId140"/>
                     <a:stretch>
                       <a:fillRect/>
                     </a:stretch>
@@ -22680,7 +22562,7 @@
                   <pic:spPr bwMode="auto">
                     <a:xfrm>
                       <a:off x="0" y="0"/>
-                      <a:ext cx="3378200" cy="5638800"/>
+                      <a:ext cx="4258674" cy="7583765"/>
                     </a:xfrm>
                     <a:prstGeom prst="rect">
                       <a:avLst/>
@@ -22725,7 +22607,7 @@
         <w:t xml:space="preserve">Plusieurs fiches officielles du systeme-de-design.gouv.fr étaient temporairement inaccessibles au moment de la rédaction. Les liens vers la documentation officielle restent la référence à jour : en cas de doute, vérifiez-y les libellés et variantes exacts.</w:t>
       </w:r>
     </w:p>
-    <w:bookmarkStart w:id="217" w:name="b.1-accordéon"/>
+    <w:bookmarkStart w:id="205" w:name="b.1-accordéon"/>
     <w:p>
       <w:pPr>
         <w:pStyle w:val="Heading3"/>
@@ -22931,7 +22813,7 @@
       <w:r>
         <w:t xml:space="preserve"> </w:t>
       </w:r>
-      <w:hyperlink r:id="rId216">
+      <w:hyperlink r:id="rId204">
         <w:r>
           <w:rPr>
             <w:rStyle w:val="Hyperlink"/>
@@ -22940,8 +22822,8 @@
         </w:r>
       </w:hyperlink>
     </w:p>
-    <w:bookmarkEnd w:id="217"/>
-    <w:bookmarkStart w:id="219" w:name="b.2-alerte"/>
+    <w:bookmarkEnd w:id="205"/>
+    <w:bookmarkStart w:id="207" w:name="b.2-alerte"/>
     <w:p>
       <w:pPr>
         <w:pStyle w:val="Heading3"/>
@@ -23139,7 +23021,7 @@
       <w:r>
         <w:t xml:space="preserve"> </w:t>
       </w:r>
-      <w:hyperlink r:id="rId218">
+      <w:hyperlink r:id="rId206">
         <w:r>
           <w:rPr>
             <w:rStyle w:val="Hyperlink"/>
@@ -23148,8 +23030,8 @@
         </w:r>
       </w:hyperlink>
     </w:p>
-    <w:bookmarkEnd w:id="219"/>
-    <w:bookmarkStart w:id="221" w:name="b.3-badge"/>
+    <w:bookmarkEnd w:id="207"/>
+    <w:bookmarkStart w:id="209" w:name="b.3-badge"/>
     <w:p>
       <w:pPr>
         <w:pStyle w:val="Heading3"/>
@@ -23343,7 +23225,7 @@
       <w:r>
         <w:t xml:space="preserve"> </w:t>
       </w:r>
-      <w:hyperlink r:id="rId220">
+      <w:hyperlink r:id="rId208">
         <w:r>
           <w:rPr>
             <w:rStyle w:val="Hyperlink"/>
@@ -23352,8 +23234,8 @@
         </w:r>
       </w:hyperlink>
     </w:p>
-    <w:bookmarkEnd w:id="221"/>
-    <w:bookmarkStart w:id="223" w:name="b.4-mise-en-avant"/>
+    <w:bookmarkEnd w:id="209"/>
+    <w:bookmarkStart w:id="211" w:name="b.4-mise-en-avant"/>
     <w:p>
       <w:pPr>
         <w:pStyle w:val="Heading3"/>
@@ -23522,7 +23404,7 @@
       <w:r>
         <w:t xml:space="preserve"> </w:t>
       </w:r>
-      <w:hyperlink r:id="rId222">
+      <w:hyperlink r:id="rId210">
         <w:r>
           <w:rPr>
             <w:rStyle w:val="Hyperlink"/>
@@ -23531,8 +23413,8 @@
         </w:r>
       </w:hyperlink>
     </w:p>
-    <w:bookmarkEnd w:id="223"/>
-    <w:bookmarkStart w:id="225" w:name="b.5-mise-en-exergue"/>
+    <w:bookmarkEnd w:id="211"/>
+    <w:bookmarkStart w:id="213" w:name="b.5-mise-en-exergue"/>
     <w:p>
       <w:pPr>
         <w:pStyle w:val="Heading3"/>
@@ -23691,7 +23573,7 @@
       <w:r>
         <w:t xml:space="preserve"> </w:t>
       </w:r>
-      <w:hyperlink r:id="rId224">
+      <w:hyperlink r:id="rId212">
         <w:r>
           <w:rPr>
             <w:rStyle w:val="Hyperlink"/>
@@ -23700,8 +23582,8 @@
         </w:r>
       </w:hyperlink>
     </w:p>
-    <w:bookmarkEnd w:id="225"/>
-    <w:bookmarkStart w:id="227" w:name="b.6-citation"/>
+    <w:bookmarkEnd w:id="213"/>
+    <w:bookmarkStart w:id="215" w:name="b.6-citation"/>
     <w:p>
       <w:pPr>
         <w:pStyle w:val="Heading3"/>
@@ -23882,7 +23764,7 @@
       <w:r>
         <w:t xml:space="preserve"> </w:t>
       </w:r>
-      <w:hyperlink r:id="rId226">
+      <w:hyperlink r:id="rId214">
         <w:r>
           <w:rPr>
             <w:rStyle w:val="Hyperlink"/>
@@ -23891,8 +23773,8 @@
         </w:r>
       </w:hyperlink>
     </w:p>
-    <w:bookmarkEnd w:id="227"/>
-    <w:bookmarkStart w:id="229" w:name="b.7-tableau"/>
+    <w:bookmarkEnd w:id="215"/>
+    <w:bookmarkStart w:id="217" w:name="b.7-tableau"/>
     <w:p>
       <w:pPr>
         <w:pStyle w:val="Heading3"/>
@@ -24057,7 +23939,7 @@
       <w:r>
         <w:t xml:space="preserve"> </w:t>
       </w:r>
-      <w:hyperlink r:id="rId228">
+      <w:hyperlink r:id="rId216">
         <w:r>
           <w:rPr>
             <w:rStyle w:val="Hyperlink"/>
@@ -24066,8 +23948,8 @@
         </w:r>
       </w:hyperlink>
     </w:p>
-    <w:bookmarkEnd w:id="229"/>
-    <w:bookmarkStart w:id="231" w:name="b.8-téléchargement-de-fichier"/>
+    <w:bookmarkEnd w:id="217"/>
+    <w:bookmarkStart w:id="219" w:name="b.8-téléchargement-de-fichier"/>
     <w:p>
       <w:pPr>
         <w:pStyle w:val="Heading3"/>
@@ -24293,7 +24175,7 @@
       <w:r>
         <w:t xml:space="preserve"> </w:t>
       </w:r>
-      <w:hyperlink r:id="rId230">
+      <w:hyperlink r:id="rId218">
         <w:r>
           <w:rPr>
             <w:rStyle w:val="Hyperlink"/>
@@ -24302,8 +24184,8 @@
         </w:r>
       </w:hyperlink>
     </w:p>
-    <w:bookmarkEnd w:id="231"/>
-    <w:bookmarkStart w:id="235" w:name="b.9-tableau-récapitulatif"/>
+    <w:bookmarkEnd w:id="219"/>
+    <w:bookmarkStart w:id="220" w:name="b.9-tableau-récapitulatif"/>
     <w:p>
       <w:pPr>
         <w:pStyle w:val="Heading3"/>
@@ -24783,63 +24665,8 @@
         </w:tc>
       </w:tr>
     </w:tbl>
-    <w:p>
-      <w:pPr>
-        <w:pStyle w:val="CaptionedFigure"/>
-      </w:pPr>
-      <w:r>
-        <w:drawing>
-          <wp:inline>
-            <wp:extent cx="3378200" cy="5638800"/>
-            <wp:effectExtent b="0" l="0" r="0" t="0"/>
-            <wp:docPr descr="Menu Templates de l’éditeur avec les composants DSFR insérables" title="" id="233" name="Picture"/>
-            <a:graphic>
-              <a:graphicData uri="http://schemas.openxmlformats.org/drawingml/2006/picture">
-                <pic:pic>
-                  <pic:nvPicPr>
-                    <pic:cNvPr descr="img/annexeB-templates.png" id="234" name="Picture"/>
-                    <pic:cNvPicPr>
-                      <a:picLocks noChangeArrowheads="1" noChangeAspect="1"/>
-                    </pic:cNvPicPr>
-                  </pic:nvPicPr>
-                  <pic:blipFill>
-                    <a:blip r:embed="rId232"/>
-                    <a:stretch>
-                      <a:fillRect/>
-                    </a:stretch>
-                  </pic:blipFill>
-                  <pic:spPr bwMode="auto">
-                    <a:xfrm>
-                      <a:off x="0" y="0"/>
-                      <a:ext cx="3378200" cy="5638800"/>
-                    </a:xfrm>
-                    <a:prstGeom prst="rect">
-                      <a:avLst/>
-                    </a:prstGeom>
-                    <a:noFill/>
-                    <a:ln w="9525">
-                      <a:noFill/>
-                      <a:headEnd/>
-                      <a:tailEnd/>
-                    </a:ln>
-                  </pic:spPr>
-                </pic:pic>
-              </a:graphicData>
-            </a:graphic>
-          </wp:inline>
-        </w:drawing>
-      </w:r>
-    </w:p>
-    <w:p>
-      <w:pPr>
-        <w:pStyle w:val="ImageCaption"/>
-      </w:pPr>
-      <w:r>
-        <w:t xml:space="preserve">Menu Templates de l’éditeur avec les composants DSFR insérables</w:t>
-      </w:r>
-    </w:p>
-    <w:bookmarkEnd w:id="235"/>
-    <w:bookmarkStart w:id="237" w:name="b.10-pour-aller-plus-loin"/>
+    <w:bookmarkEnd w:id="220"/>
+    <w:bookmarkStart w:id="222" w:name="b.10-pour-aller-plus-loin"/>
     <w:p>
       <w:pPr>
         <w:pStyle w:val="Heading3"/>
@@ -24874,7 +24701,7 @@
       <w:r>
         <w:t xml:space="preserve"> </w:t>
       </w:r>
-      <w:hyperlink r:id="rId236">
+      <w:hyperlink r:id="rId221">
         <w:r>
           <w:rPr>
             <w:rStyle w:val="Hyperlink"/>
@@ -24900,9 +24727,9 @@
         </w:pict>
       </w:r>
     </w:p>
-    <w:bookmarkEnd w:id="237"/>
-    <w:bookmarkEnd w:id="238"/>
-    <w:bookmarkEnd w:id="239"/>
+    <w:bookmarkEnd w:id="222"/>
+    <w:bookmarkEnd w:id="223"/>
+    <w:bookmarkEnd w:id="224"/>
     <w:sectPr>
       <w:footnotePr>
         <w:numRestart w:val="eachSect"/>

</xml_diff>